<commit_message>
Adjust DOCX font size defaults
</commit_message>
<xml_diff>
--- a/assets/template.docx
+++ b/assets/template.docx
@@ -4,7 +4,7 @@
   <w:body>
     <w:p>
       <w:pPr>
-        <w:spacing w:after="0" w:line="360" w:lineRule="auto"/>
+        <w:spacing w:after="0" w:line="360" w:lineRule="auto" w:before="0"/>
         <w:ind w:firstLine="480"/>
         <w:jc w:val="both"/>
       </w:pPr>
@@ -12,14 +12,14 @@
         <w:rPr>
           <w:rFonts w:ascii="Times New Roman" w:eastAsia="宋体" w:hAnsi="Times New Roman" w:cs="Times New Roman"/>
           <w:b/>
-          <w:sz w:val="32"/>
+          <w:sz w:val="24"/>
         </w:rPr>
         <w:t>中文论文格式参考模板</w:t>
       </w:r>
     </w:p>
     <w:p>
       <w:pPr>
-        <w:spacing w:after="0" w:line="360" w:lineRule="auto"/>
+        <w:spacing w:after="0" w:line="360" w:lineRule="auto" w:before="0"/>
         <w:ind w:firstLine="480"/>
         <w:jc w:val="both"/>
       </w:pPr>
@@ -40,7 +40,7 @@
     </w:p>
     <w:p>
       <w:pPr>
-        <w:spacing w:after="0" w:line="360" w:lineRule="auto"/>
+        <w:spacing w:after="0" w:line="360" w:lineRule="auto" w:before="0"/>
         <w:ind w:firstLine="480"/>
         <w:jc w:val="both"/>
       </w:pPr>
@@ -89,7 +89,7 @@
     </w:p>
     <w:p>
       <w:pPr>
-        <w:spacing w:after="0" w:line="360" w:lineRule="auto"/>
+        <w:spacing w:after="0" w:line="360" w:lineRule="auto" w:before="0"/>
         <w:ind w:firstLine="480"/>
         <w:jc w:val="both"/>
         <w:outlineLvl w:val="0"/>
@@ -121,7 +121,7 @@
     </w:p>
     <w:p>
       <w:pPr>
-        <w:spacing w:after="0" w:line="360" w:lineRule="auto"/>
+        <w:spacing w:after="0" w:line="360" w:lineRule="auto" w:before="0"/>
         <w:ind w:firstLine="480"/>
         <w:jc w:val="both"/>
       </w:pPr>
@@ -163,7 +163,7 @@
     </w:p>
     <w:p>
       <w:pPr>
-        <w:spacing w:after="0" w:line="360" w:lineRule="auto"/>
+        <w:spacing w:after="0" w:line="360" w:lineRule="auto" w:before="0"/>
         <w:ind w:firstLine="480"/>
         <w:jc w:val="both"/>
       </w:pPr>
@@ -177,7 +177,7 @@
     </w:p>
     <w:p>
       <w:pPr>
-        <w:spacing w:after="0" w:line="360" w:lineRule="auto"/>
+        <w:spacing w:after="0" w:line="360" w:lineRule="auto" w:before="0"/>
         <w:ind w:firstLine="480"/>
         <w:jc w:val="both"/>
       </w:pPr>
@@ -208,19 +208,23 @@
     </w:p>
     <w:p>
       <w:pPr>
-        <w:spacing w:after="0" w:line="360" w:lineRule="auto"/>
+        <w:spacing w:after="0" w:line="360" w:lineRule="auto" w:before="0"/>
+        <w:ind w:firstLine="0"/>
+        <w:jc w:val="left"/>
       </w:pPr>
       <w:r>
         <w:rPr>
           <w:rFonts w:ascii="Times New Roman" w:eastAsia="宋体" w:hAnsi="Times New Roman" w:cs="Times New Roman"/>
-          <w:sz w:val="24"/>
+          <w:sz w:val="28"/>
         </w:rPr>
         <w:t>一、研究背景与问题提出</w:t>
       </w:r>
     </w:p>
     <w:p>
       <w:pPr>
-        <w:spacing w:after="0" w:line="360" w:lineRule="auto"/>
+        <w:spacing w:after="0" w:line="360" w:lineRule="auto" w:before="0"/>
+        <w:ind w:firstLine="0"/>
+        <w:jc w:val="left"/>
       </w:pPr>
       <w:r>
         <w:rPr>
@@ -239,7 +243,9 @@
     </w:p>
     <w:p>
       <w:pPr>
-        <w:spacing w:after="0" w:line="360" w:lineRule="auto"/>
+        <w:spacing w:after="0" w:line="360" w:lineRule="auto" w:before="0"/>
+        <w:ind w:firstLine="0"/>
+        <w:jc w:val="left"/>
       </w:pPr>
       <w:r>
         <w:rPr>
@@ -258,7 +264,7 @@
     </w:p>
     <w:p>
       <w:pPr>
-        <w:spacing w:after="0" w:line="360" w:lineRule="auto"/>
+        <w:spacing w:after="0" w:line="360" w:lineRule="auto" w:before="0"/>
         <w:ind w:firstLine="480"/>
         <w:jc w:val="both"/>
       </w:pPr>
@@ -272,62 +278,36 @@
     </w:p>
     <w:p>
       <w:pPr>
-        <w:spacing w:after="0" w:line="360" w:lineRule="auto"/>
+        <w:spacing w:after="0" w:line="360" w:lineRule="auto" w:before="0"/>
+        <w:ind w:firstLine="0"/>
+        <w:jc w:val="left"/>
         <w:outlineLvl w:val="0"/>
       </w:pPr>
       <w:r>
         <w:rPr>
           <w:rFonts w:ascii="Times New Roman" w:eastAsia="宋体" w:hAnsi="Times New Roman" w:cs="Times New Roman"/>
           <w:b/>
-          <w:sz w:val="24"/>
+          <w:sz w:val="28"/>
         </w:rPr>
         <w:t>一、研究背景与问题提出</w:t>
       </w:r>
     </w:p>
     <w:p>
       <w:pPr>
-        <w:spacing w:after="0" w:line="360" w:lineRule="auto"/>
+        <w:spacing w:after="0" w:line="360" w:lineRule="auto" w:before="0"/>
         <w:ind w:firstLine="480"/>
         <w:jc w:val="both"/>
       </w:pPr>
       <w:r>
         <w:rPr>
-          <w:rFonts w:ascii="Times New Roman" w:eastAsia="宋体" w:hAnsi="Times New Roman" w:cs="Times New Roman"/>
+          <w:rFonts w:ascii="Times New Roman" w:hAnsi="Times New Roman" w:cs="Times New Roman" w:eastAsia="宋体"/>
           <w:sz w:val="24"/>
         </w:rPr>
-        <w:t>本模板用于展示中文论文</w:t>
+        <w:t>本模板用于展示中文论文 DOCX 的默认排版效果。正文采用宋体，英文和数字如 Times New Roman 2026 使用西文字体；中文引号示例：</w:t>
       </w:r>
       <w:r>
         <w:rPr>
-          <w:rFonts w:ascii="Times New Roman" w:eastAsia="宋体" w:hAnsi="Times New Roman" w:cs="Times New Roman"/>
-          <w:sz w:val="24"/>
-        </w:rPr>
-        <w:t xml:space="preserve"> DOCX </w:t>
-      </w:r>
-      <w:r>
-        <w:rPr>
-          <w:rFonts w:ascii="Times New Roman" w:eastAsia="宋体" w:hAnsi="Times New Roman" w:cs="Times New Roman"/>
-          <w:sz w:val="24"/>
-        </w:rPr>
-        <w:t>的默认排版效果。正文采用宋体，英文和数字如</w:t>
-      </w:r>
-      <w:r>
-        <w:rPr>
-          <w:rFonts w:ascii="Times New Roman" w:eastAsia="宋体" w:hAnsi="Times New Roman" w:cs="Times New Roman"/>
-          <w:sz w:val="24"/>
-        </w:rPr>
-        <w:t xml:space="preserve"> Times New Roman 2026 </w:t>
-      </w:r>
-      <w:r>
-        <w:rPr>
-          <w:rFonts w:ascii="Times New Roman" w:eastAsia="宋体" w:hAnsi="Times New Roman" w:cs="Times New Roman"/>
-          <w:sz w:val="24"/>
-        </w:rPr>
-        <w:t>使用西文字体；中文引号示例：</w:t>
-      </w:r>
-      <w:r>
-        <w:rPr>
-          <w:rFonts w:ascii="宋体" w:eastAsia="宋体" w:hAnsi="宋体" w:cs="宋体" w:hint="eastAsia"/>
+          <w:rFonts w:ascii="宋体" w:hAnsi="宋体" w:cs="宋体" w:eastAsia="宋体" w:hint="eastAsia"/>
           <w:sz w:val="24"/>
           <w:lang w:eastAsia="zh-CN"/>
         </w:rPr>
@@ -335,14 +315,14 @@
       </w:r>
       <w:r>
         <w:rPr>
-          <w:rFonts w:ascii="Times New Roman" w:eastAsia="宋体" w:hAnsi="Times New Roman" w:cs="Times New Roman"/>
+          <w:rFonts w:ascii="Times New Roman" w:hAnsi="Times New Roman" w:cs="Times New Roman" w:eastAsia="宋体"/>
           <w:sz w:val="24"/>
         </w:rPr>
         <w:t>数字经济</w:t>
       </w:r>
       <w:r>
         <w:rPr>
-          <w:rFonts w:ascii="宋体" w:eastAsia="宋体" w:hAnsi="宋体" w:cs="宋体" w:hint="eastAsia"/>
+          <w:rFonts w:ascii="宋体" w:hAnsi="宋体" w:cs="宋体" w:eastAsia="宋体" w:hint="eastAsia"/>
           <w:sz w:val="24"/>
           <w:lang w:eastAsia="zh-CN"/>
         </w:rPr>
@@ -350,7 +330,7 @@
       </w:r>
       <w:r>
         <w:rPr>
-          <w:rFonts w:ascii="Times New Roman" w:eastAsia="宋体" w:hAnsi="Times New Roman" w:cs="Times New Roman"/>
+          <w:rFonts w:ascii="Times New Roman" w:hAnsi="Times New Roman" w:cs="Times New Roman" w:eastAsia="宋体"/>
           <w:sz w:val="24"/>
         </w:rPr>
         <w:t>。若原文存在半角直引号，格式化脚本会将其转换为中文引号，并将引号本身设为宋体。</w:t>
@@ -358,7 +338,9 @@
     </w:p>
     <w:p>
       <w:pPr>
-        <w:spacing w:after="0" w:line="360" w:lineRule="auto"/>
+        <w:spacing w:after="0" w:line="360" w:lineRule="auto" w:before="0"/>
+        <w:ind w:firstLine="0"/>
+        <w:jc w:val="left"/>
         <w:outlineLvl w:val="1"/>
       </w:pPr>
       <w:r>
@@ -380,7 +362,7 @@
     </w:p>
     <w:p>
       <w:pPr>
-        <w:spacing w:after="0" w:line="360" w:lineRule="auto"/>
+        <w:spacing w:after="0" w:line="360" w:lineRule="auto" w:before="0"/>
         <w:ind w:firstLine="480"/>
         <w:jc w:val="both"/>
       </w:pPr>
@@ -394,7 +376,9 @@
     </w:p>
     <w:p>
       <w:pPr>
-        <w:spacing w:after="0" w:line="360" w:lineRule="auto"/>
+        <w:spacing w:after="0" w:line="360" w:lineRule="auto" w:before="0"/>
+        <w:ind w:firstLine="0"/>
+        <w:jc w:val="left"/>
         <w:outlineLvl w:val="2"/>
       </w:pPr>
       <w:r>
@@ -416,7 +400,7 @@
     </w:p>
     <w:p>
       <w:pPr>
-        <w:spacing w:after="0" w:line="360" w:lineRule="auto"/>
+        <w:spacing w:after="0" w:line="360" w:lineRule="auto" w:before="0"/>
         <w:ind w:firstLine="480"/>
         <w:jc w:val="both"/>
       </w:pPr>
@@ -430,7 +414,9 @@
     </w:p>
     <w:p>
       <w:pPr>
-        <w:spacing w:after="0" w:line="360" w:lineRule="auto"/>
+        <w:spacing w:after="0" w:line="360" w:lineRule="auto" w:before="0"/>
+        <w:ind w:firstLine="0"/>
+        <w:jc w:val="left"/>
         <w:outlineLvl w:val="1"/>
       </w:pPr>
       <w:r>
@@ -452,7 +438,7 @@
     </w:p>
     <w:p>
       <w:pPr>
-        <w:spacing w:after="0" w:line="360" w:lineRule="auto"/>
+        <w:spacing w:after="0" w:line="360" w:lineRule="auto" w:before="0"/>
         <w:ind w:firstLine="480"/>
         <w:jc w:val="both"/>
       </w:pPr>
@@ -466,27 +452,28 @@
     </w:p>
     <w:p>
       <w:pPr>
-        <w:spacing w:after="0" w:line="360" w:lineRule="auto"/>
+        <w:spacing w:after="0" w:line="360" w:lineRule="auto" w:before="0"/>
+        <w:ind w:firstLine="0"/>
         <w:jc w:val="center"/>
       </w:pPr>
       <w:r>
         <w:rPr>
           <w:rFonts w:ascii="Times New Roman" w:eastAsia="宋体" w:hAnsi="Times New Roman" w:cs="Times New Roman"/>
-          <w:sz w:val="24"/>
+          <w:sz w:val="21"/>
         </w:rPr>
         <w:t>表</w:t>
       </w:r>
       <w:r>
         <w:rPr>
           <w:rFonts w:ascii="Times New Roman" w:eastAsia="宋体" w:hAnsi="Times New Roman" w:cs="Times New Roman"/>
-          <w:sz w:val="24"/>
+          <w:sz w:val="21"/>
         </w:rPr>
         <w:t xml:space="preserve">1  </w:t>
       </w:r>
       <w:r>
         <w:rPr>
           <w:rFonts w:ascii="Times New Roman" w:eastAsia="宋体" w:hAnsi="Times New Roman" w:cs="Times New Roman"/>
-          <w:sz w:val="24"/>
+          <w:sz w:val="21"/>
         </w:rPr>
         <w:t>变量设计示例</w:t>
       </w:r>
@@ -514,18 +501,21 @@
               <w:left w:val="nil"/>
               <w:bottom w:val="single" w:sz="6" w:space="0" w:color="000000"/>
               <w:right w:val="nil"/>
+              <w:insideH w:val="nil"/>
+              <w:insideV w:val="nil"/>
             </w:tcBorders>
             <w:vAlign w:val="center"/>
           </w:tcPr>
           <w:p>
             <w:pPr>
-              <w:spacing w:after="0" w:line="360" w:lineRule="auto"/>
+              <w:spacing w:after="0" w:line="360" w:lineRule="auto" w:before="0"/>
+              <w:ind w:firstLine="0"/>
               <w:jc w:val="center"/>
             </w:pPr>
             <w:r>
               <w:rPr>
                 <w:rFonts w:ascii="Times New Roman" w:eastAsia="宋体" w:hAnsi="Times New Roman" w:cs="Times New Roman"/>
-                <w:sz w:val="24"/>
+                <w:sz w:val="18"/>
               </w:rPr>
               <w:t>变量类别</w:t>
             </w:r>
@@ -539,18 +529,21 @@
               <w:left w:val="nil"/>
               <w:bottom w:val="single" w:sz="6" w:space="0" w:color="000000"/>
               <w:right w:val="nil"/>
+              <w:insideH w:val="nil"/>
+              <w:insideV w:val="nil"/>
             </w:tcBorders>
             <w:vAlign w:val="center"/>
           </w:tcPr>
           <w:p>
             <w:pPr>
-              <w:spacing w:after="0" w:line="360" w:lineRule="auto"/>
+              <w:spacing w:after="0" w:line="360" w:lineRule="auto" w:before="0"/>
+              <w:ind w:firstLine="0"/>
               <w:jc w:val="center"/>
             </w:pPr>
             <w:r>
               <w:rPr>
                 <w:rFonts w:ascii="Times New Roman" w:eastAsia="宋体" w:hAnsi="Times New Roman" w:cs="Times New Roman"/>
-                <w:sz w:val="24"/>
+                <w:sz w:val="18"/>
               </w:rPr>
               <w:t>变量名称</w:t>
             </w:r>
@@ -564,18 +557,21 @@
               <w:left w:val="nil"/>
               <w:bottom w:val="single" w:sz="6" w:space="0" w:color="000000"/>
               <w:right w:val="nil"/>
+              <w:insideH w:val="nil"/>
+              <w:insideV w:val="nil"/>
             </w:tcBorders>
             <w:vAlign w:val="center"/>
           </w:tcPr>
           <w:p>
             <w:pPr>
-              <w:spacing w:after="0" w:line="360" w:lineRule="auto"/>
+              <w:spacing w:after="0" w:line="360" w:lineRule="auto" w:before="0"/>
+              <w:ind w:firstLine="0"/>
               <w:jc w:val="center"/>
             </w:pPr>
             <w:r>
               <w:rPr>
                 <w:rFonts w:ascii="Times New Roman" w:eastAsia="宋体" w:hAnsi="Times New Roman" w:cs="Times New Roman"/>
-                <w:sz w:val="24"/>
+                <w:sz w:val="18"/>
               </w:rPr>
               <w:t>说明</w:t>
             </w:r>
@@ -594,18 +590,21 @@
               <w:left w:val="nil"/>
               <w:bottom w:val="nil"/>
               <w:right w:val="nil"/>
+              <w:insideH w:val="nil"/>
+              <w:insideV w:val="nil"/>
             </w:tcBorders>
             <w:vAlign w:val="center"/>
           </w:tcPr>
           <w:p>
             <w:pPr>
-              <w:spacing w:after="0" w:line="360" w:lineRule="auto"/>
+              <w:spacing w:after="0" w:line="360" w:lineRule="auto" w:before="0"/>
+              <w:ind w:firstLine="0"/>
               <w:jc w:val="center"/>
             </w:pPr>
             <w:r>
               <w:rPr>
                 <w:rFonts w:ascii="Times New Roman" w:eastAsia="宋体" w:hAnsi="Times New Roman" w:cs="Times New Roman"/>
-                <w:sz w:val="24"/>
+                <w:sz w:val="18"/>
               </w:rPr>
               <w:t>被解释变量</w:t>
             </w:r>
@@ -619,18 +618,21 @@
               <w:left w:val="nil"/>
               <w:bottom w:val="nil"/>
               <w:right w:val="nil"/>
+              <w:insideH w:val="nil"/>
+              <w:insideV w:val="nil"/>
             </w:tcBorders>
             <w:vAlign w:val="center"/>
           </w:tcPr>
           <w:p>
             <w:pPr>
-              <w:spacing w:after="0" w:line="360" w:lineRule="auto"/>
+              <w:spacing w:after="0" w:line="360" w:lineRule="auto" w:before="0"/>
+              <w:ind w:firstLine="0"/>
               <w:jc w:val="center"/>
             </w:pPr>
             <w:r>
               <w:rPr>
                 <w:rFonts w:ascii="Times New Roman" w:eastAsia="宋体" w:hAnsi="Times New Roman" w:cs="Times New Roman"/>
-                <w:sz w:val="24"/>
+                <w:sz w:val="18"/>
               </w:rPr>
               <w:t>大学生就业率</w:t>
             </w:r>
@@ -644,18 +646,21 @@
               <w:left w:val="nil"/>
               <w:bottom w:val="nil"/>
               <w:right w:val="nil"/>
+              <w:insideH w:val="nil"/>
+              <w:insideV w:val="nil"/>
             </w:tcBorders>
             <w:vAlign w:val="center"/>
           </w:tcPr>
           <w:p>
             <w:pPr>
-              <w:spacing w:after="0" w:line="360" w:lineRule="auto"/>
+              <w:spacing w:after="0" w:line="360" w:lineRule="auto" w:before="0"/>
+              <w:ind w:firstLine="0"/>
               <w:jc w:val="center"/>
             </w:pPr>
             <w:r>
               <w:rPr>
                 <w:rFonts w:ascii="Times New Roman" w:eastAsia="宋体" w:hAnsi="Times New Roman" w:cs="Times New Roman"/>
-                <w:sz w:val="24"/>
+                <w:sz w:val="18"/>
               </w:rPr>
               <w:t>用于衡量大学生就业结果</w:t>
             </w:r>
@@ -674,18 +679,21 @@
               <w:left w:val="nil"/>
               <w:bottom w:val="nil"/>
               <w:right w:val="nil"/>
+              <w:insideH w:val="nil"/>
+              <w:insideV w:val="nil"/>
             </w:tcBorders>
             <w:vAlign w:val="center"/>
           </w:tcPr>
           <w:p>
             <w:pPr>
-              <w:spacing w:after="0" w:line="360" w:lineRule="auto"/>
+              <w:spacing w:after="0" w:line="360" w:lineRule="auto" w:before="0"/>
+              <w:ind w:firstLine="0"/>
               <w:jc w:val="center"/>
             </w:pPr>
             <w:r>
               <w:rPr>
                 <w:rFonts w:ascii="Times New Roman" w:eastAsia="宋体" w:hAnsi="Times New Roman" w:cs="Times New Roman"/>
-                <w:sz w:val="24"/>
+                <w:sz w:val="18"/>
               </w:rPr>
               <w:t>核心解释变量</w:t>
             </w:r>
@@ -699,18 +707,21 @@
               <w:left w:val="nil"/>
               <w:bottom w:val="nil"/>
               <w:right w:val="nil"/>
+              <w:insideH w:val="nil"/>
+              <w:insideV w:val="nil"/>
             </w:tcBorders>
             <w:vAlign w:val="center"/>
           </w:tcPr>
           <w:p>
             <w:pPr>
-              <w:spacing w:after="0" w:line="360" w:lineRule="auto"/>
+              <w:spacing w:after="0" w:line="360" w:lineRule="auto" w:before="0"/>
+              <w:ind w:firstLine="0"/>
               <w:jc w:val="center"/>
             </w:pPr>
             <w:r>
               <w:rPr>
                 <w:rFonts w:ascii="Times New Roman" w:eastAsia="宋体" w:hAnsi="Times New Roman" w:cs="Times New Roman"/>
-                <w:sz w:val="24"/>
+                <w:sz w:val="18"/>
               </w:rPr>
               <w:t>数字经济发展水平</w:t>
             </w:r>
@@ -724,18 +735,21 @@
               <w:left w:val="nil"/>
               <w:bottom w:val="nil"/>
               <w:right w:val="nil"/>
+              <w:insideH w:val="nil"/>
+              <w:insideV w:val="nil"/>
             </w:tcBorders>
             <w:vAlign w:val="center"/>
           </w:tcPr>
           <w:p>
             <w:pPr>
-              <w:spacing w:after="0" w:line="360" w:lineRule="auto"/>
+              <w:spacing w:after="0" w:line="360" w:lineRule="auto" w:before="0"/>
+              <w:ind w:firstLine="0"/>
               <w:jc w:val="center"/>
             </w:pPr>
             <w:r>
               <w:rPr>
                 <w:rFonts w:ascii="Times New Roman" w:eastAsia="宋体" w:hAnsi="Times New Roman" w:cs="Times New Roman"/>
-                <w:sz w:val="24"/>
+                <w:sz w:val="18"/>
               </w:rPr>
               <w:t>可由多维指标综合测度</w:t>
             </w:r>
@@ -754,18 +768,21 @@
               <w:left w:val="nil"/>
               <w:bottom w:val="single" w:sz="12" w:space="0" w:color="000000"/>
               <w:right w:val="nil"/>
+              <w:insideH w:val="nil"/>
+              <w:insideV w:val="nil"/>
             </w:tcBorders>
             <w:vAlign w:val="center"/>
           </w:tcPr>
           <w:p>
             <w:pPr>
-              <w:spacing w:after="0" w:line="360" w:lineRule="auto"/>
+              <w:spacing w:after="0" w:line="360" w:lineRule="auto" w:before="0"/>
+              <w:ind w:firstLine="0"/>
               <w:jc w:val="center"/>
             </w:pPr>
             <w:r>
               <w:rPr>
                 <w:rFonts w:ascii="Times New Roman" w:eastAsia="宋体" w:hAnsi="Times New Roman" w:cs="Times New Roman"/>
-                <w:sz w:val="24"/>
+                <w:sz w:val="18"/>
               </w:rPr>
               <w:lastRenderedPageBreak/>
               <w:t>控制变量</w:t>
@@ -780,18 +797,21 @@
               <w:left w:val="nil"/>
               <w:bottom w:val="single" w:sz="12" w:space="0" w:color="000000"/>
               <w:right w:val="nil"/>
+              <w:insideH w:val="nil"/>
+              <w:insideV w:val="nil"/>
             </w:tcBorders>
             <w:vAlign w:val="center"/>
           </w:tcPr>
           <w:p>
             <w:pPr>
-              <w:spacing w:after="0" w:line="360" w:lineRule="auto"/>
+              <w:spacing w:after="0" w:line="360" w:lineRule="auto" w:before="0"/>
+              <w:ind w:firstLine="0"/>
               <w:jc w:val="center"/>
             </w:pPr>
             <w:r>
               <w:rPr>
                 <w:rFonts w:ascii="Times New Roman" w:eastAsia="宋体" w:hAnsi="Times New Roman" w:cs="Times New Roman"/>
-                <w:sz w:val="24"/>
+                <w:sz w:val="18"/>
               </w:rPr>
               <w:t>个体与地区特征</w:t>
             </w:r>
@@ -805,18 +825,21 @@
               <w:left w:val="nil"/>
               <w:bottom w:val="single" w:sz="12" w:space="0" w:color="000000"/>
               <w:right w:val="nil"/>
+              <w:insideH w:val="nil"/>
+              <w:insideV w:val="nil"/>
             </w:tcBorders>
             <w:vAlign w:val="center"/>
           </w:tcPr>
           <w:p>
             <w:pPr>
-              <w:spacing w:after="0" w:line="360" w:lineRule="auto"/>
+              <w:spacing w:after="0" w:line="360" w:lineRule="auto" w:before="0"/>
+              <w:ind w:firstLine="0"/>
               <w:jc w:val="center"/>
             </w:pPr>
             <w:r>
               <w:rPr>
                 <w:rFonts w:ascii="Times New Roman" w:eastAsia="宋体" w:hAnsi="Times New Roman" w:cs="Times New Roman"/>
-                <w:sz w:val="24"/>
+                <w:sz w:val="18"/>
               </w:rPr>
               <w:t>用于降低遗漏变量影响</w:t>
             </w:r>
@@ -826,48 +849,51 @@
     </w:tbl>
     <w:p>
       <w:pPr>
-        <w:spacing w:after="0" w:line="360" w:lineRule="auto"/>
+        <w:spacing w:after="0" w:line="360" w:lineRule="auto" w:before="0"/>
+        <w:ind w:firstLine="0"/>
         <w:jc w:val="center"/>
       </w:pPr>
       <w:r>
         <w:rPr>
           <w:rFonts w:ascii="Times New Roman" w:eastAsia="宋体" w:hAnsi="Times New Roman" w:cs="Times New Roman"/>
-          <w:sz w:val="24"/>
+          <w:sz w:val="21"/>
         </w:rPr>
         <w:t>图</w:t>
       </w:r>
       <w:r>
         <w:rPr>
           <w:rFonts w:ascii="Times New Roman" w:eastAsia="宋体" w:hAnsi="Times New Roman" w:cs="Times New Roman"/>
-          <w:sz w:val="24"/>
+          <w:sz w:val="21"/>
         </w:rPr>
         <w:t xml:space="preserve">1  </w:t>
       </w:r>
       <w:r>
         <w:rPr>
           <w:rFonts w:ascii="Times New Roman" w:eastAsia="宋体" w:hAnsi="Times New Roman" w:cs="Times New Roman"/>
-          <w:sz w:val="24"/>
+          <w:sz w:val="21"/>
         </w:rPr>
         <w:t>图片题注示例（插入图片后，图片段落和题注均应居中）</w:t>
       </w:r>
     </w:p>
     <w:p>
       <w:pPr>
-        <w:spacing w:after="0" w:line="360" w:lineRule="auto"/>
+        <w:spacing w:after="0" w:line="360" w:lineRule="auto" w:before="0"/>
+        <w:ind w:firstLine="0"/>
+        <w:jc w:val="left"/>
         <w:outlineLvl w:val="0"/>
       </w:pPr>
       <w:r>
         <w:rPr>
           <w:rFonts w:ascii="Times New Roman" w:eastAsia="宋体" w:hAnsi="Times New Roman" w:cs="Times New Roman"/>
           <w:b/>
-          <w:sz w:val="24"/>
+          <w:sz w:val="28"/>
         </w:rPr>
         <w:t>二、结论与写作提示</w:t>
       </w:r>
     </w:p>
     <w:p>
       <w:pPr>
-        <w:spacing w:after="0" w:line="360" w:lineRule="auto"/>
+        <w:spacing w:after="0" w:line="360" w:lineRule="auto" w:before="0"/>
         <w:ind w:firstLine="480"/>
         <w:jc w:val="both"/>
       </w:pPr>
@@ -881,7 +907,7 @@
     </w:p>
     <w:p>
       <w:pPr>
-        <w:spacing w:after="0" w:line="360" w:lineRule="auto"/>
+        <w:spacing w:after="0" w:line="360" w:lineRule="auto" w:before="0"/>
         <w:ind w:firstLine="480"/>
         <w:jc w:val="both"/>
         <w:outlineLvl w:val="0"/>
@@ -897,7 +923,8 @@
     </w:p>
     <w:p>
       <w:pPr>
-        <w:spacing w:after="0" w:line="360" w:lineRule="auto"/>
+        <w:spacing w:after="0" w:line="360" w:lineRule="auto" w:before="0"/>
+        <w:ind w:firstLine="0"/>
         <w:jc w:val="both"/>
       </w:pPr>
       <w:r>
@@ -952,7 +979,8 @@
     </w:p>
     <w:p>
       <w:pPr>
-        <w:spacing w:after="0" w:line="360" w:lineRule="auto"/>
+        <w:spacing w:after="0" w:line="360" w:lineRule="auto" w:before="0"/>
+        <w:ind w:firstLine="0"/>
         <w:jc w:val="both"/>
       </w:pPr>
       <w:r>

</xml_diff>

<commit_message>
Rename skill and update font size rules
</commit_message>
<xml_diff>
--- a/assets/template.docx
+++ b/assets/template.docx
@@ -4,7 +4,7 @@
   <w:body>
     <w:p>
       <w:pPr>
-        <w:spacing w:after="0" w:line="360" w:lineRule="auto" w:before="0"/>
+        <w:spacing w:after="0" w:line="360" w:lineRule="auto"/>
         <w:ind w:firstLine="480"/>
         <w:jc w:val="both"/>
       </w:pPr>
@@ -19,7 +19,7 @@
     </w:p>
     <w:p>
       <w:pPr>
-        <w:spacing w:after="0" w:line="360" w:lineRule="auto" w:before="0"/>
+        <w:spacing w:after="0" w:line="360" w:lineRule="auto"/>
         <w:ind w:firstLine="480"/>
         <w:jc w:val="both"/>
       </w:pPr>
@@ -40,7 +40,7 @@
     </w:p>
     <w:p>
       <w:pPr>
-        <w:spacing w:after="0" w:line="360" w:lineRule="auto" w:before="0"/>
+        <w:spacing w:after="0" w:line="360" w:lineRule="auto"/>
         <w:ind w:firstLine="480"/>
         <w:jc w:val="both"/>
       </w:pPr>
@@ -89,7 +89,7 @@
     </w:p>
     <w:p>
       <w:pPr>
-        <w:spacing w:after="0" w:line="360" w:lineRule="auto" w:before="0"/>
+        <w:spacing w:after="0" w:line="360" w:lineRule="auto"/>
         <w:ind w:firstLine="480"/>
         <w:jc w:val="both"/>
         <w:outlineLvl w:val="0"/>
@@ -121,7 +121,7 @@
     </w:p>
     <w:p>
       <w:pPr>
-        <w:spacing w:after="0" w:line="360" w:lineRule="auto" w:before="0"/>
+        <w:spacing w:after="0" w:line="360" w:lineRule="auto"/>
         <w:ind w:firstLine="480"/>
         <w:jc w:val="both"/>
       </w:pPr>
@@ -163,7 +163,7 @@
     </w:p>
     <w:p>
       <w:pPr>
-        <w:spacing w:after="0" w:line="360" w:lineRule="auto" w:before="0"/>
+        <w:spacing w:after="0" w:line="360" w:lineRule="auto"/>
         <w:ind w:firstLine="480"/>
         <w:jc w:val="both"/>
       </w:pPr>
@@ -177,7 +177,7 @@
     </w:p>
     <w:p>
       <w:pPr>
-        <w:spacing w:after="0" w:line="360" w:lineRule="auto" w:before="0"/>
+        <w:spacing w:after="0" w:line="360" w:lineRule="auto"/>
         <w:ind w:firstLine="480"/>
         <w:jc w:val="both"/>
       </w:pPr>
@@ -208,9 +208,7 @@
     </w:p>
     <w:p>
       <w:pPr>
-        <w:spacing w:after="0" w:line="360" w:lineRule="auto" w:before="0"/>
-        <w:ind w:firstLine="0"/>
-        <w:jc w:val="left"/>
+        <w:spacing w:after="0" w:line="360" w:lineRule="auto"/>
       </w:pPr>
       <w:r>
         <w:rPr>
@@ -222,9 +220,7 @@
     </w:p>
     <w:p>
       <w:pPr>
-        <w:spacing w:after="0" w:line="360" w:lineRule="auto" w:before="0"/>
-        <w:ind w:firstLine="0"/>
-        <w:jc w:val="left"/>
+        <w:spacing w:after="0" w:line="360" w:lineRule="auto"/>
       </w:pPr>
       <w:r>
         <w:rPr>
@@ -243,9 +239,7 @@
     </w:p>
     <w:p>
       <w:pPr>
-        <w:spacing w:after="0" w:line="360" w:lineRule="auto" w:before="0"/>
-        <w:ind w:firstLine="0"/>
-        <w:jc w:val="left"/>
+        <w:spacing w:after="0" w:line="360" w:lineRule="auto"/>
       </w:pPr>
       <w:r>
         <w:rPr>
@@ -264,7 +258,7 @@
     </w:p>
     <w:p>
       <w:pPr>
-        <w:spacing w:after="0" w:line="360" w:lineRule="auto" w:before="0"/>
+        <w:spacing w:after="0" w:line="360" w:lineRule="auto"/>
         <w:ind w:firstLine="480"/>
         <w:jc w:val="both"/>
       </w:pPr>
@@ -278,9 +272,7 @@
     </w:p>
     <w:p>
       <w:pPr>
-        <w:spacing w:after="0" w:line="360" w:lineRule="auto" w:before="0"/>
-        <w:ind w:firstLine="0"/>
-        <w:jc w:val="left"/>
+        <w:spacing w:after="0" w:line="360" w:lineRule="auto"/>
         <w:outlineLvl w:val="0"/>
       </w:pPr>
       <w:r>
@@ -294,20 +286,48 @@
     </w:p>
     <w:p>
       <w:pPr>
-        <w:spacing w:after="0" w:line="360" w:lineRule="auto" w:before="0"/>
+        <w:spacing w:after="0" w:line="360" w:lineRule="auto"/>
         <w:ind w:firstLine="480"/>
         <w:jc w:val="both"/>
       </w:pPr>
       <w:r>
         <w:rPr>
-          <w:rFonts w:ascii="Times New Roman" w:hAnsi="Times New Roman" w:cs="Times New Roman" w:eastAsia="宋体"/>
+          <w:rFonts w:ascii="Times New Roman" w:eastAsia="宋体" w:hAnsi="Times New Roman" w:cs="Times New Roman"/>
           <w:sz w:val="24"/>
         </w:rPr>
-        <w:t>本模板用于展示中文论文 DOCX 的默认排版效果。正文采用宋体，英文和数字如 Times New Roman 2026 使用西文字体；中文引号示例：</w:t>
+        <w:t>本模板用于展示中文论文</w:t>
       </w:r>
       <w:r>
         <w:rPr>
-          <w:rFonts w:ascii="宋体" w:hAnsi="宋体" w:cs="宋体" w:eastAsia="宋体" w:hint="eastAsia"/>
+          <w:rFonts w:ascii="Times New Roman" w:eastAsia="宋体" w:hAnsi="Times New Roman" w:cs="Times New Roman"/>
+          <w:sz w:val="24"/>
+        </w:rPr>
+        <w:t xml:space="preserve"> DOCX </w:t>
+      </w:r>
+      <w:r>
+        <w:rPr>
+          <w:rFonts w:ascii="Times New Roman" w:eastAsia="宋体" w:hAnsi="Times New Roman" w:cs="Times New Roman"/>
+          <w:sz w:val="24"/>
+        </w:rPr>
+        <w:t>的默认排版效果。正文采用宋体，英文和数字如</w:t>
+      </w:r>
+      <w:r>
+        <w:rPr>
+          <w:rFonts w:ascii="Times New Roman" w:eastAsia="宋体" w:hAnsi="Times New Roman" w:cs="Times New Roman"/>
+          <w:sz w:val="24"/>
+        </w:rPr>
+        <w:t xml:space="preserve"> Times New Roman 2026 </w:t>
+      </w:r>
+      <w:r>
+        <w:rPr>
+          <w:rFonts w:ascii="Times New Roman" w:eastAsia="宋体" w:hAnsi="Times New Roman" w:cs="Times New Roman"/>
+          <w:sz w:val="24"/>
+        </w:rPr>
+        <w:t>使用西文字体；中文引号示例：</w:t>
+      </w:r>
+      <w:r>
+        <w:rPr>
+          <w:rFonts w:ascii="宋体" w:eastAsia="宋体" w:hAnsi="宋体" w:cs="宋体" w:hint="eastAsia"/>
           <w:sz w:val="24"/>
           <w:lang w:eastAsia="zh-CN"/>
         </w:rPr>
@@ -315,14 +335,14 @@
       </w:r>
       <w:r>
         <w:rPr>
-          <w:rFonts w:ascii="Times New Roman" w:hAnsi="Times New Roman" w:cs="Times New Roman" w:eastAsia="宋体"/>
+          <w:rFonts w:ascii="Times New Roman" w:eastAsia="宋体" w:hAnsi="Times New Roman" w:cs="Times New Roman"/>
           <w:sz w:val="24"/>
         </w:rPr>
         <w:t>数字经济</w:t>
       </w:r>
       <w:r>
         <w:rPr>
-          <w:rFonts w:ascii="宋体" w:hAnsi="宋体" w:cs="宋体" w:eastAsia="宋体" w:hint="eastAsia"/>
+          <w:rFonts w:ascii="宋体" w:eastAsia="宋体" w:hAnsi="宋体" w:cs="宋体" w:hint="eastAsia"/>
           <w:sz w:val="24"/>
           <w:lang w:eastAsia="zh-CN"/>
         </w:rPr>
@@ -330,7 +350,7 @@
       </w:r>
       <w:r>
         <w:rPr>
-          <w:rFonts w:ascii="Times New Roman" w:hAnsi="Times New Roman" w:cs="Times New Roman" w:eastAsia="宋体"/>
+          <w:rFonts w:ascii="Times New Roman" w:eastAsia="宋体" w:hAnsi="Times New Roman" w:cs="Times New Roman"/>
           <w:sz w:val="24"/>
         </w:rPr>
         <w:t>。若原文存在半角直引号，格式化脚本会将其转换为中文引号，并将引号本身设为宋体。</w:t>
@@ -338,9 +358,7 @@
     </w:p>
     <w:p>
       <w:pPr>
-        <w:spacing w:after="0" w:line="360" w:lineRule="auto" w:before="0"/>
-        <w:ind w:firstLine="0"/>
-        <w:jc w:val="left"/>
+        <w:spacing w:after="0" w:line="360" w:lineRule="auto"/>
         <w:outlineLvl w:val="1"/>
       </w:pPr>
       <w:r>
@@ -362,7 +380,7 @@
     </w:p>
     <w:p>
       <w:pPr>
-        <w:spacing w:after="0" w:line="360" w:lineRule="auto" w:before="0"/>
+        <w:spacing w:after="0" w:line="360" w:lineRule="auto"/>
         <w:ind w:firstLine="480"/>
         <w:jc w:val="both"/>
       </w:pPr>
@@ -376,9 +394,7 @@
     </w:p>
     <w:p>
       <w:pPr>
-        <w:spacing w:after="0" w:line="360" w:lineRule="auto" w:before="0"/>
-        <w:ind w:firstLine="0"/>
-        <w:jc w:val="left"/>
+        <w:spacing w:after="0" w:line="360" w:lineRule="auto"/>
         <w:outlineLvl w:val="2"/>
       </w:pPr>
       <w:r>
@@ -400,7 +416,7 @@
     </w:p>
     <w:p>
       <w:pPr>
-        <w:spacing w:after="0" w:line="360" w:lineRule="auto" w:before="0"/>
+        <w:spacing w:after="0" w:line="360" w:lineRule="auto"/>
         <w:ind w:firstLine="480"/>
         <w:jc w:val="both"/>
       </w:pPr>
@@ -414,9 +430,7 @@
     </w:p>
     <w:p>
       <w:pPr>
-        <w:spacing w:after="0" w:line="360" w:lineRule="auto" w:before="0"/>
-        <w:ind w:firstLine="0"/>
-        <w:jc w:val="left"/>
+        <w:spacing w:after="0" w:line="360" w:lineRule="auto"/>
         <w:outlineLvl w:val="1"/>
       </w:pPr>
       <w:r>
@@ -438,7 +452,7 @@
     </w:p>
     <w:p>
       <w:pPr>
-        <w:spacing w:after="0" w:line="360" w:lineRule="auto" w:before="0"/>
+        <w:spacing w:after="0" w:line="360" w:lineRule="auto"/>
         <w:ind w:firstLine="480"/>
         <w:jc w:val="both"/>
       </w:pPr>
@@ -452,8 +466,7 @@
     </w:p>
     <w:p>
       <w:pPr>
-        <w:spacing w:after="0" w:line="360" w:lineRule="auto" w:before="0"/>
-        <w:ind w:firstLine="0"/>
+        <w:spacing w:after="0" w:line="360" w:lineRule="auto"/>
         <w:jc w:val="center"/>
       </w:pPr>
       <w:r>
@@ -501,15 +514,12 @@
               <w:left w:val="nil"/>
               <w:bottom w:val="single" w:sz="6" w:space="0" w:color="000000"/>
               <w:right w:val="nil"/>
-              <w:insideH w:val="nil"/>
-              <w:insideV w:val="nil"/>
             </w:tcBorders>
             <w:vAlign w:val="center"/>
           </w:tcPr>
           <w:p>
             <w:pPr>
-              <w:spacing w:after="0" w:line="360" w:lineRule="auto" w:before="0"/>
-              <w:ind w:firstLine="0"/>
+              <w:spacing w:after="0" w:line="360" w:lineRule="auto"/>
               <w:jc w:val="center"/>
             </w:pPr>
             <w:r>
@@ -529,15 +539,12 @@
               <w:left w:val="nil"/>
               <w:bottom w:val="single" w:sz="6" w:space="0" w:color="000000"/>
               <w:right w:val="nil"/>
-              <w:insideH w:val="nil"/>
-              <w:insideV w:val="nil"/>
             </w:tcBorders>
             <w:vAlign w:val="center"/>
           </w:tcPr>
           <w:p>
             <w:pPr>
-              <w:spacing w:after="0" w:line="360" w:lineRule="auto" w:before="0"/>
-              <w:ind w:firstLine="0"/>
+              <w:spacing w:after="0" w:line="360" w:lineRule="auto"/>
               <w:jc w:val="center"/>
             </w:pPr>
             <w:r>
@@ -557,15 +564,12 @@
               <w:left w:val="nil"/>
               <w:bottom w:val="single" w:sz="6" w:space="0" w:color="000000"/>
               <w:right w:val="nil"/>
-              <w:insideH w:val="nil"/>
-              <w:insideV w:val="nil"/>
             </w:tcBorders>
             <w:vAlign w:val="center"/>
           </w:tcPr>
           <w:p>
             <w:pPr>
-              <w:spacing w:after="0" w:line="360" w:lineRule="auto" w:before="0"/>
-              <w:ind w:firstLine="0"/>
+              <w:spacing w:after="0" w:line="360" w:lineRule="auto"/>
               <w:jc w:val="center"/>
             </w:pPr>
             <w:r>
@@ -590,15 +594,12 @@
               <w:left w:val="nil"/>
               <w:bottom w:val="nil"/>
               <w:right w:val="nil"/>
-              <w:insideH w:val="nil"/>
-              <w:insideV w:val="nil"/>
             </w:tcBorders>
             <w:vAlign w:val="center"/>
           </w:tcPr>
           <w:p>
             <w:pPr>
-              <w:spacing w:after="0" w:line="360" w:lineRule="auto" w:before="0"/>
-              <w:ind w:firstLine="0"/>
+              <w:spacing w:after="0" w:line="360" w:lineRule="auto"/>
               <w:jc w:val="center"/>
             </w:pPr>
             <w:r>
@@ -618,15 +619,12 @@
               <w:left w:val="nil"/>
               <w:bottom w:val="nil"/>
               <w:right w:val="nil"/>
-              <w:insideH w:val="nil"/>
-              <w:insideV w:val="nil"/>
             </w:tcBorders>
             <w:vAlign w:val="center"/>
           </w:tcPr>
           <w:p>
             <w:pPr>
-              <w:spacing w:after="0" w:line="360" w:lineRule="auto" w:before="0"/>
-              <w:ind w:firstLine="0"/>
+              <w:spacing w:after="0" w:line="360" w:lineRule="auto"/>
               <w:jc w:val="center"/>
             </w:pPr>
             <w:r>
@@ -646,15 +644,12 @@
               <w:left w:val="nil"/>
               <w:bottom w:val="nil"/>
               <w:right w:val="nil"/>
-              <w:insideH w:val="nil"/>
-              <w:insideV w:val="nil"/>
             </w:tcBorders>
             <w:vAlign w:val="center"/>
           </w:tcPr>
           <w:p>
             <w:pPr>
-              <w:spacing w:after="0" w:line="360" w:lineRule="auto" w:before="0"/>
-              <w:ind w:firstLine="0"/>
+              <w:spacing w:after="0" w:line="360" w:lineRule="auto"/>
               <w:jc w:val="center"/>
             </w:pPr>
             <w:r>
@@ -679,15 +674,12 @@
               <w:left w:val="nil"/>
               <w:bottom w:val="nil"/>
               <w:right w:val="nil"/>
-              <w:insideH w:val="nil"/>
-              <w:insideV w:val="nil"/>
             </w:tcBorders>
             <w:vAlign w:val="center"/>
           </w:tcPr>
           <w:p>
             <w:pPr>
-              <w:spacing w:after="0" w:line="360" w:lineRule="auto" w:before="0"/>
-              <w:ind w:firstLine="0"/>
+              <w:spacing w:after="0" w:line="360" w:lineRule="auto"/>
               <w:jc w:val="center"/>
             </w:pPr>
             <w:r>
@@ -707,15 +699,12 @@
               <w:left w:val="nil"/>
               <w:bottom w:val="nil"/>
               <w:right w:val="nil"/>
-              <w:insideH w:val="nil"/>
-              <w:insideV w:val="nil"/>
             </w:tcBorders>
             <w:vAlign w:val="center"/>
           </w:tcPr>
           <w:p>
             <w:pPr>
-              <w:spacing w:after="0" w:line="360" w:lineRule="auto" w:before="0"/>
-              <w:ind w:firstLine="0"/>
+              <w:spacing w:after="0" w:line="360" w:lineRule="auto"/>
               <w:jc w:val="center"/>
             </w:pPr>
             <w:r>
@@ -735,15 +724,12 @@
               <w:left w:val="nil"/>
               <w:bottom w:val="nil"/>
               <w:right w:val="nil"/>
-              <w:insideH w:val="nil"/>
-              <w:insideV w:val="nil"/>
             </w:tcBorders>
             <w:vAlign w:val="center"/>
           </w:tcPr>
           <w:p>
             <w:pPr>
-              <w:spacing w:after="0" w:line="360" w:lineRule="auto" w:before="0"/>
-              <w:ind w:firstLine="0"/>
+              <w:spacing w:after="0" w:line="360" w:lineRule="auto"/>
               <w:jc w:val="center"/>
             </w:pPr>
             <w:r>
@@ -768,15 +754,12 @@
               <w:left w:val="nil"/>
               <w:bottom w:val="single" w:sz="12" w:space="0" w:color="000000"/>
               <w:right w:val="nil"/>
-              <w:insideH w:val="nil"/>
-              <w:insideV w:val="nil"/>
             </w:tcBorders>
             <w:vAlign w:val="center"/>
           </w:tcPr>
           <w:p>
             <w:pPr>
-              <w:spacing w:after="0" w:line="360" w:lineRule="auto" w:before="0"/>
-              <w:ind w:firstLine="0"/>
+              <w:spacing w:after="0" w:line="360" w:lineRule="auto"/>
               <w:jc w:val="center"/>
             </w:pPr>
             <w:r>
@@ -784,7 +767,6 @@
                 <w:rFonts w:ascii="Times New Roman" w:eastAsia="宋体" w:hAnsi="Times New Roman" w:cs="Times New Roman"/>
                 <w:sz w:val="18"/>
               </w:rPr>
-              <w:lastRenderedPageBreak/>
               <w:t>控制变量</w:t>
             </w:r>
           </w:p>
@@ -797,15 +779,12 @@
               <w:left w:val="nil"/>
               <w:bottom w:val="single" w:sz="12" w:space="0" w:color="000000"/>
               <w:right w:val="nil"/>
-              <w:insideH w:val="nil"/>
-              <w:insideV w:val="nil"/>
             </w:tcBorders>
             <w:vAlign w:val="center"/>
           </w:tcPr>
           <w:p>
             <w:pPr>
-              <w:spacing w:after="0" w:line="360" w:lineRule="auto" w:before="0"/>
-              <w:ind w:firstLine="0"/>
+              <w:spacing w:after="0" w:line="360" w:lineRule="auto"/>
               <w:jc w:val="center"/>
             </w:pPr>
             <w:r>
@@ -825,15 +804,12 @@
               <w:left w:val="nil"/>
               <w:bottom w:val="single" w:sz="12" w:space="0" w:color="000000"/>
               <w:right w:val="nil"/>
-              <w:insideH w:val="nil"/>
-              <w:insideV w:val="nil"/>
             </w:tcBorders>
             <w:vAlign w:val="center"/>
           </w:tcPr>
           <w:p>
             <w:pPr>
-              <w:spacing w:after="0" w:line="360" w:lineRule="auto" w:before="0"/>
-              <w:ind w:firstLine="0"/>
+              <w:spacing w:after="0" w:line="360" w:lineRule="auto"/>
               <w:jc w:val="center"/>
             </w:pPr>
             <w:r>
@@ -849,8 +825,7 @@
     </w:tbl>
     <w:p>
       <w:pPr>
-        <w:spacing w:after="0" w:line="360" w:lineRule="auto" w:before="0"/>
-        <w:ind w:firstLine="0"/>
+        <w:spacing w:after="0" w:line="360" w:lineRule="auto"/>
         <w:jc w:val="center"/>
       </w:pPr>
       <w:r>
@@ -877,9 +852,7 @@
     </w:p>
     <w:p>
       <w:pPr>
-        <w:spacing w:after="0" w:line="360" w:lineRule="auto" w:before="0"/>
-        <w:ind w:firstLine="0"/>
-        <w:jc w:val="left"/>
+        <w:spacing w:after="0" w:line="360" w:lineRule="auto"/>
         <w:outlineLvl w:val="0"/>
       </w:pPr>
       <w:r>
@@ -888,12 +861,13 @@
           <w:b/>
           <w:sz w:val="28"/>
         </w:rPr>
+        <w:lastRenderedPageBreak/>
         <w:t>二、结论与写作提示</w:t>
       </w:r>
     </w:p>
     <w:p>
       <w:pPr>
-        <w:spacing w:after="0" w:line="360" w:lineRule="auto" w:before="0"/>
+        <w:spacing w:after="0" w:line="360" w:lineRule="auto"/>
         <w:ind w:firstLine="480"/>
         <w:jc w:val="both"/>
       </w:pPr>
@@ -907,7 +881,7 @@
     </w:p>
     <w:p>
       <w:pPr>
-        <w:spacing w:after="0" w:line="360" w:lineRule="auto" w:before="0"/>
+        <w:spacing w:after="0" w:line="360" w:lineRule="auto"/>
         <w:ind w:firstLine="480"/>
         <w:jc w:val="both"/>
         <w:outlineLvl w:val="0"/>
@@ -923,8 +897,7 @@
     </w:p>
     <w:p>
       <w:pPr>
-        <w:spacing w:after="0" w:line="360" w:lineRule="auto" w:before="0"/>
-        <w:ind w:firstLine="0"/>
+        <w:spacing w:after="0" w:line="360" w:lineRule="auto"/>
         <w:jc w:val="both"/>
       </w:pPr>
       <w:r>
@@ -979,8 +952,7 @@
     </w:p>
     <w:p>
       <w:pPr>
-        <w:spacing w:after="0" w:line="360" w:lineRule="auto" w:before="0"/>
-        <w:ind w:firstLine="0"/>
+        <w:spacing w:after="0" w:line="360" w:lineRule="auto"/>
         <w:jc w:val="both"/>
       </w:pPr>
       <w:r>

</xml_diff>

<commit_message>
Constrain captions colors and math requirements
</commit_message>
<xml_diff>
--- a/assets/template.docx
+++ b/assets/template.docx
@@ -4,7 +4,7 @@
   <w:body>
     <w:p>
       <w:pPr>
-        <w:spacing w:after="0" w:line="360" w:lineRule="auto"/>
+        <w:spacing w:after="0" w:line="360" w:lineRule="auto" w:before="0"/>
         <w:ind w:firstLine="480"/>
         <w:jc w:val="both"/>
       </w:pPr>
@@ -12,6 +12,7 @@
         <w:rPr>
           <w:rFonts w:ascii="Times New Roman" w:eastAsia="宋体" w:hAnsi="Times New Roman" w:cs="Times New Roman"/>
           <w:b/>
+          <w:color w:val="000000"/>
           <w:sz w:val="24"/>
         </w:rPr>
         <w:t>中文论文格式参考模板</w:t>
@@ -19,13 +20,14 @@
     </w:p>
     <w:p>
       <w:pPr>
-        <w:spacing w:after="0" w:line="360" w:lineRule="auto"/>
+        <w:spacing w:after="0" w:line="360" w:lineRule="auto" w:before="0"/>
         <w:ind w:firstLine="480"/>
         <w:jc w:val="both"/>
       </w:pPr>
       <w:r>
         <w:rPr>
           <w:rFonts w:ascii="Times New Roman" w:eastAsia="宋体" w:hAnsi="Times New Roman" w:cs="Times New Roman"/>
+          <w:color w:val="000000"/>
           <w:sz w:val="24"/>
         </w:rPr>
         <w:t>——</w:t>
@@ -33,6 +35,7 @@
       <w:r>
         <w:rPr>
           <w:rFonts w:ascii="Times New Roman" w:eastAsia="宋体" w:hAnsi="Times New Roman" w:cs="Times New Roman"/>
+          <w:color w:val="000000"/>
           <w:sz w:val="24"/>
         </w:rPr>
         <w:t>适用于课程论文、案例论文、理论框架与中文研究报告</w:t>
@@ -40,13 +43,14 @@
     </w:p>
     <w:p>
       <w:pPr>
-        <w:spacing w:after="0" w:line="360" w:lineRule="auto"/>
+        <w:spacing w:after="0" w:line="360" w:lineRule="auto" w:before="0"/>
         <w:ind w:firstLine="480"/>
         <w:jc w:val="both"/>
       </w:pPr>
       <w:r>
         <w:rPr>
           <w:rFonts w:ascii="Times New Roman" w:eastAsia="宋体" w:hAnsi="Times New Roman" w:cs="Times New Roman"/>
+          <w:color w:val="000000"/>
           <w:sz w:val="24"/>
         </w:rPr>
         <w:t>作者姓名：</w:t>
@@ -54,6 +58,7 @@
       <w:r>
         <w:rPr>
           <w:rFonts w:ascii="Times New Roman" w:eastAsia="宋体" w:hAnsi="Times New Roman" w:cs="Times New Roman"/>
+          <w:color w:val="000000"/>
           <w:sz w:val="24"/>
         </w:rPr>
         <w:t xml:space="preserve">__________    </w:t>
@@ -61,6 +66,7 @@
       <w:r>
         <w:rPr>
           <w:rFonts w:ascii="Times New Roman" w:eastAsia="宋体" w:hAnsi="Times New Roman" w:cs="Times New Roman"/>
+          <w:color w:val="000000"/>
           <w:sz w:val="24"/>
         </w:rPr>
         <w:t>学号：</w:t>
@@ -68,6 +74,7 @@
       <w:r>
         <w:rPr>
           <w:rFonts w:ascii="Times New Roman" w:eastAsia="宋体" w:hAnsi="Times New Roman" w:cs="Times New Roman"/>
+          <w:color w:val="000000"/>
           <w:sz w:val="24"/>
         </w:rPr>
         <w:t xml:space="preserve">__________    </w:t>
@@ -75,6 +82,7 @@
       <w:r>
         <w:rPr>
           <w:rFonts w:ascii="Times New Roman" w:eastAsia="宋体" w:hAnsi="Times New Roman" w:cs="Times New Roman"/>
+          <w:color w:val="000000"/>
           <w:sz w:val="24"/>
         </w:rPr>
         <w:t>学院：</w:t>
@@ -82,6 +90,7 @@
       <w:r>
         <w:rPr>
           <w:rFonts w:ascii="Times New Roman" w:eastAsia="宋体" w:hAnsi="Times New Roman" w:cs="Times New Roman"/>
+          <w:color w:val="000000"/>
           <w:sz w:val="24"/>
         </w:rPr>
         <w:t>__________</w:t>
@@ -89,7 +98,7 @@
     </w:p>
     <w:p>
       <w:pPr>
-        <w:spacing w:after="0" w:line="360" w:lineRule="auto"/>
+        <w:spacing w:after="0" w:line="360" w:lineRule="auto" w:before="0"/>
         <w:ind w:firstLine="480"/>
         <w:jc w:val="both"/>
         <w:outlineLvl w:val="0"/>
@@ -98,6 +107,7 @@
         <w:rPr>
           <w:rFonts w:ascii="Times New Roman" w:eastAsia="宋体" w:hAnsi="Times New Roman" w:cs="Times New Roman"/>
           <w:b/>
+          <w:color w:val="000000"/>
           <w:sz w:val="24"/>
         </w:rPr>
         <w:t>摘</w:t>
@@ -106,6 +116,7 @@
         <w:rPr>
           <w:rFonts w:ascii="Times New Roman" w:eastAsia="宋体" w:hAnsi="Times New Roman" w:cs="Times New Roman"/>
           <w:b/>
+          <w:color w:val="000000"/>
           <w:sz w:val="24"/>
         </w:rPr>
         <w:t xml:space="preserve">  </w:t>
@@ -114,6 +125,7 @@
         <w:rPr>
           <w:rFonts w:ascii="Times New Roman" w:eastAsia="宋体" w:hAnsi="Times New Roman" w:cs="Times New Roman"/>
           <w:b/>
+          <w:color w:val="000000"/>
           <w:sz w:val="24"/>
         </w:rPr>
         <w:t>要</w:t>
@@ -121,13 +133,14 @@
     </w:p>
     <w:p>
       <w:pPr>
-        <w:spacing w:after="0" w:line="360" w:lineRule="auto"/>
+        <w:spacing w:after="0" w:line="360" w:lineRule="auto" w:before="0"/>
         <w:ind w:firstLine="480"/>
         <w:jc w:val="both"/>
       </w:pPr>
       <w:r>
         <w:rPr>
           <w:rFonts w:ascii="Times New Roman" w:eastAsia="宋体" w:hAnsi="Times New Roman" w:cs="Times New Roman"/>
+          <w:color w:val="000000"/>
           <w:sz w:val="24"/>
         </w:rPr>
         <w:t>摘要部分概括研究背景、研究问题、研究方法和主要结论。中文摘要正文使用宋体，段前段后为</w:t>
@@ -135,6 +148,7 @@
       <w:r>
         <w:rPr>
           <w:rFonts w:ascii="Times New Roman" w:eastAsia="宋体" w:hAnsi="Times New Roman" w:cs="Times New Roman"/>
+          <w:color w:val="000000"/>
           <w:sz w:val="24"/>
         </w:rPr>
         <w:t xml:space="preserve"> 0</w:t>
@@ -142,6 +156,7 @@
       <w:r>
         <w:rPr>
           <w:rFonts w:ascii="Times New Roman" w:eastAsia="宋体" w:hAnsi="Times New Roman" w:cs="Times New Roman"/>
+          <w:color w:val="000000"/>
           <w:sz w:val="24"/>
         </w:rPr>
         <w:t>，行距为</w:t>
@@ -149,6 +164,7 @@
       <w:r>
         <w:rPr>
           <w:rFonts w:ascii="Times New Roman" w:eastAsia="宋体" w:hAnsi="Times New Roman" w:cs="Times New Roman"/>
+          <w:color w:val="000000"/>
           <w:sz w:val="24"/>
         </w:rPr>
         <w:t xml:space="preserve"> 1.5 </w:t>
@@ -156,6 +172,7 @@
       <w:r>
         <w:rPr>
           <w:rFonts w:ascii="Times New Roman" w:eastAsia="宋体" w:hAnsi="Times New Roman" w:cs="Times New Roman"/>
+          <w:color w:val="000000"/>
           <w:sz w:val="24"/>
         </w:rPr>
         <w:t>倍，首行缩进两个中文字符。</w:t>
@@ -163,13 +180,14 @@
     </w:p>
     <w:p>
       <w:pPr>
-        <w:spacing w:after="0" w:line="360" w:lineRule="auto"/>
+        <w:spacing w:after="0" w:line="360" w:lineRule="auto" w:before="0"/>
         <w:ind w:firstLine="480"/>
         <w:jc w:val="both"/>
       </w:pPr>
       <w:r>
         <w:rPr>
           <w:rFonts w:ascii="Times New Roman" w:eastAsia="宋体" w:hAnsi="Times New Roman" w:cs="Times New Roman"/>
+          <w:color w:val="000000"/>
           <w:sz w:val="24"/>
         </w:rPr>
         <w:t>关键词：数字经济；大学生就业；信息检索；三线表；论文排版</w:t>
@@ -177,7 +195,7 @@
     </w:p>
     <w:p>
       <w:pPr>
-        <w:spacing w:after="0" w:line="360" w:lineRule="auto"/>
+        <w:spacing w:after="0" w:line="360" w:lineRule="auto" w:before="0"/>
         <w:ind w:firstLine="480"/>
         <w:jc w:val="both"/>
       </w:pPr>
@@ -185,6 +203,7 @@
         <w:rPr>
           <w:rFonts w:ascii="Times New Roman" w:eastAsia="宋体" w:hAnsi="Times New Roman" w:cs="Times New Roman"/>
           <w:b/>
+          <w:color w:val="000000"/>
           <w:sz w:val="24"/>
         </w:rPr>
         <w:t>目</w:t>
@@ -193,6 +212,7 @@
         <w:rPr>
           <w:rFonts w:ascii="Times New Roman" w:eastAsia="宋体" w:hAnsi="Times New Roman" w:cs="Times New Roman"/>
           <w:b/>
+          <w:color w:val="000000"/>
           <w:sz w:val="24"/>
         </w:rPr>
         <w:t xml:space="preserve">  </w:t>
@@ -201,6 +221,7 @@
         <w:rPr>
           <w:rFonts w:ascii="Times New Roman" w:eastAsia="宋体" w:hAnsi="Times New Roman" w:cs="Times New Roman"/>
           <w:b/>
+          <w:color w:val="000000"/>
           <w:sz w:val="24"/>
         </w:rPr>
         <w:t>录（更新域后显示）</w:t>
@@ -208,11 +229,14 @@
     </w:p>
     <w:p>
       <w:pPr>
-        <w:spacing w:after="0" w:line="360" w:lineRule="auto"/>
+        <w:spacing w:after="0" w:line="360" w:lineRule="auto" w:before="0"/>
+        <w:ind w:firstLine="0"/>
+        <w:jc w:val="left"/>
       </w:pPr>
       <w:r>
         <w:rPr>
           <w:rFonts w:ascii="Times New Roman" w:eastAsia="宋体" w:hAnsi="Times New Roman" w:cs="Times New Roman"/>
+          <w:color w:val="000000"/>
           <w:sz w:val="28"/>
         </w:rPr>
         <w:t>一、研究背景与问题提出</w:t>
@@ -220,11 +244,14 @@
     </w:p>
     <w:p>
       <w:pPr>
-        <w:spacing w:after="0" w:line="360" w:lineRule="auto"/>
+        <w:spacing w:after="0" w:line="360" w:lineRule="auto" w:before="0"/>
+        <w:ind w:firstLine="0"/>
+        <w:jc w:val="left"/>
       </w:pPr>
       <w:r>
         <w:rPr>
           <w:rFonts w:ascii="Times New Roman" w:eastAsia="宋体" w:hAnsi="Times New Roman" w:cs="Times New Roman"/>
+          <w:color w:val="000000"/>
           <w:sz w:val="24"/>
         </w:rPr>
         <w:t xml:space="preserve">1.1 </w:t>
@@ -232,6 +259,7 @@
       <w:r>
         <w:rPr>
           <w:rFonts w:ascii="Times New Roman" w:eastAsia="宋体" w:hAnsi="Times New Roman" w:cs="Times New Roman"/>
+          <w:color w:val="000000"/>
           <w:sz w:val="24"/>
         </w:rPr>
         <w:t>研究背景</w:t>
@@ -239,11 +267,14 @@
     </w:p>
     <w:p>
       <w:pPr>
-        <w:spacing w:after="0" w:line="360" w:lineRule="auto"/>
+        <w:spacing w:after="0" w:line="360" w:lineRule="auto" w:before="0"/>
+        <w:ind w:firstLine="0"/>
+        <w:jc w:val="left"/>
       </w:pPr>
       <w:r>
         <w:rPr>
           <w:rFonts w:ascii="Times New Roman" w:eastAsia="宋体" w:hAnsi="Times New Roman" w:cs="Times New Roman"/>
+          <w:color w:val="000000"/>
           <w:sz w:val="24"/>
         </w:rPr>
         <w:t xml:space="preserve">1.1.1 </w:t>
@@ -251,6 +282,7 @@
       <w:r>
         <w:rPr>
           <w:rFonts w:ascii="Times New Roman" w:eastAsia="宋体" w:hAnsi="Times New Roman" w:cs="Times New Roman"/>
+          <w:color w:val="000000"/>
           <w:sz w:val="24"/>
         </w:rPr>
         <w:t>数字经济与就业结构</w:t>
@@ -258,13 +290,14 @@
     </w:p>
     <w:p>
       <w:pPr>
-        <w:spacing w:after="0" w:line="360" w:lineRule="auto"/>
+        <w:spacing w:after="0" w:line="360" w:lineRule="auto" w:before="0"/>
         <w:ind w:firstLine="480"/>
         <w:jc w:val="both"/>
       </w:pPr>
       <w:r>
         <w:rPr>
           <w:rFonts w:ascii="Times New Roman" w:eastAsia="宋体" w:hAnsi="Times New Roman" w:cs="Times New Roman"/>
+          <w:color w:val="000000"/>
           <w:sz w:val="24"/>
         </w:rPr>
         <w:t>参考文献</w:t>
@@ -272,13 +305,16 @@
     </w:p>
     <w:p>
       <w:pPr>
-        <w:spacing w:after="0" w:line="360" w:lineRule="auto"/>
+        <w:spacing w:after="0" w:line="360" w:lineRule="auto" w:before="0"/>
+        <w:ind w:firstLine="0"/>
+        <w:jc w:val="left"/>
         <w:outlineLvl w:val="0"/>
       </w:pPr>
       <w:r>
         <w:rPr>
           <w:rFonts w:ascii="Times New Roman" w:eastAsia="宋体" w:hAnsi="Times New Roman" w:cs="Times New Roman"/>
           <w:b/>
+          <w:color w:val="000000"/>
           <w:sz w:val="28"/>
         </w:rPr>
         <w:t>一、研究背景与问题提出</w:t>
@@ -286,48 +322,22 @@
     </w:p>
     <w:p>
       <w:pPr>
-        <w:spacing w:after="0" w:line="360" w:lineRule="auto"/>
+        <w:spacing w:after="0" w:line="360" w:lineRule="auto" w:before="0"/>
         <w:ind w:firstLine="480"/>
         <w:jc w:val="both"/>
       </w:pPr>
       <w:r>
         <w:rPr>
-          <w:rFonts w:ascii="Times New Roman" w:eastAsia="宋体" w:hAnsi="Times New Roman" w:cs="Times New Roman"/>
+          <w:rFonts w:ascii="Times New Roman" w:hAnsi="Times New Roman" w:cs="Times New Roman" w:eastAsia="宋体"/>
+          <w:color w:val="000000"/>
           <w:sz w:val="24"/>
         </w:rPr>
-        <w:t>本模板用于展示中文论文</w:t>
+        <w:t>本模板用于展示中文论文 DOCX 的默认排版效果。正文采用宋体，英文和数字如 Times New Roman 2026 使用西文字体；中文引号示例：</w:t>
       </w:r>
       <w:r>
         <w:rPr>
-          <w:rFonts w:ascii="Times New Roman" w:eastAsia="宋体" w:hAnsi="Times New Roman" w:cs="Times New Roman"/>
-          <w:sz w:val="24"/>
-        </w:rPr>
-        <w:t xml:space="preserve"> DOCX </w:t>
-      </w:r>
-      <w:r>
-        <w:rPr>
-          <w:rFonts w:ascii="Times New Roman" w:eastAsia="宋体" w:hAnsi="Times New Roman" w:cs="Times New Roman"/>
-          <w:sz w:val="24"/>
-        </w:rPr>
-        <w:t>的默认排版效果。正文采用宋体，英文和数字如</w:t>
-      </w:r>
-      <w:r>
-        <w:rPr>
-          <w:rFonts w:ascii="Times New Roman" w:eastAsia="宋体" w:hAnsi="Times New Roman" w:cs="Times New Roman"/>
-          <w:sz w:val="24"/>
-        </w:rPr>
-        <w:t xml:space="preserve"> Times New Roman 2026 </w:t>
-      </w:r>
-      <w:r>
-        <w:rPr>
-          <w:rFonts w:ascii="Times New Roman" w:eastAsia="宋体" w:hAnsi="Times New Roman" w:cs="Times New Roman"/>
-          <w:sz w:val="24"/>
-        </w:rPr>
-        <w:t>使用西文字体；中文引号示例：</w:t>
-      </w:r>
-      <w:r>
-        <w:rPr>
-          <w:rFonts w:ascii="宋体" w:eastAsia="宋体" w:hAnsi="宋体" w:cs="宋体" w:hint="eastAsia"/>
+          <w:rFonts w:ascii="宋体" w:hAnsi="宋体" w:cs="宋体" w:eastAsia="宋体" w:hint="eastAsia"/>
+          <w:color w:val="000000"/>
           <w:sz w:val="24"/>
           <w:lang w:eastAsia="zh-CN"/>
         </w:rPr>
@@ -335,14 +345,16 @@
       </w:r>
       <w:r>
         <w:rPr>
-          <w:rFonts w:ascii="Times New Roman" w:eastAsia="宋体" w:hAnsi="Times New Roman" w:cs="Times New Roman"/>
+          <w:rFonts w:ascii="Times New Roman" w:hAnsi="Times New Roman" w:cs="Times New Roman" w:eastAsia="宋体"/>
+          <w:color w:val="000000"/>
           <w:sz w:val="24"/>
         </w:rPr>
         <w:t>数字经济</w:t>
       </w:r>
       <w:r>
         <w:rPr>
-          <w:rFonts w:ascii="宋体" w:eastAsia="宋体" w:hAnsi="宋体" w:cs="宋体" w:hint="eastAsia"/>
+          <w:rFonts w:ascii="宋体" w:hAnsi="宋体" w:cs="宋体" w:eastAsia="宋体" w:hint="eastAsia"/>
+          <w:color w:val="000000"/>
           <w:sz w:val="24"/>
           <w:lang w:eastAsia="zh-CN"/>
         </w:rPr>
@@ -350,7 +362,8 @@
       </w:r>
       <w:r>
         <w:rPr>
-          <w:rFonts w:ascii="Times New Roman" w:eastAsia="宋体" w:hAnsi="Times New Roman" w:cs="Times New Roman"/>
+          <w:rFonts w:ascii="Times New Roman" w:hAnsi="Times New Roman" w:cs="Times New Roman" w:eastAsia="宋体"/>
+          <w:color w:val="000000"/>
           <w:sz w:val="24"/>
         </w:rPr>
         <w:t>。若原文存在半角直引号，格式化脚本会将其转换为中文引号，并将引号本身设为宋体。</w:t>
@@ -358,13 +371,16 @@
     </w:p>
     <w:p>
       <w:pPr>
-        <w:spacing w:after="0" w:line="360" w:lineRule="auto"/>
+        <w:spacing w:after="0" w:line="360" w:lineRule="auto" w:before="0"/>
+        <w:ind w:firstLine="0"/>
+        <w:jc w:val="left"/>
         <w:outlineLvl w:val="1"/>
       </w:pPr>
       <w:r>
         <w:rPr>
           <w:rFonts w:ascii="Times New Roman" w:eastAsia="宋体" w:hAnsi="Times New Roman" w:cs="Times New Roman"/>
           <w:b/>
+          <w:color w:val="000000"/>
           <w:sz w:val="24"/>
         </w:rPr>
         <w:t xml:space="preserve">1.1 </w:t>
@@ -373,6 +389,7 @@
         <w:rPr>
           <w:rFonts w:ascii="Times New Roman" w:eastAsia="宋体" w:hAnsi="Times New Roman" w:cs="Times New Roman"/>
           <w:b/>
+          <w:color w:val="000000"/>
           <w:sz w:val="24"/>
         </w:rPr>
         <w:t>研究背景</w:t>
@@ -380,13 +397,14 @@
     </w:p>
     <w:p>
       <w:pPr>
-        <w:spacing w:after="0" w:line="360" w:lineRule="auto"/>
+        <w:spacing w:after="0" w:line="360" w:lineRule="auto" w:before="0"/>
         <w:ind w:firstLine="480"/>
         <w:jc w:val="both"/>
       </w:pPr>
       <w:r>
         <w:rPr>
           <w:rFonts w:ascii="Times New Roman" w:eastAsia="宋体" w:hAnsi="Times New Roman" w:cs="Times New Roman"/>
+          <w:color w:val="000000"/>
           <w:sz w:val="24"/>
         </w:rPr>
         <w:t>二级标题用于组织章节内部的主要问题。正文段落两端对齐，首行缩进两个中文字符；如果用户给出模板，则优先遵循用户模板。</w:t>
@@ -394,13 +412,16 @@
     </w:p>
     <w:p>
       <w:pPr>
-        <w:spacing w:after="0" w:line="360" w:lineRule="auto"/>
+        <w:spacing w:after="0" w:line="360" w:lineRule="auto" w:before="0"/>
+        <w:ind w:firstLine="0"/>
+        <w:jc w:val="left"/>
         <w:outlineLvl w:val="2"/>
       </w:pPr>
       <w:r>
         <w:rPr>
           <w:rFonts w:ascii="Times New Roman" w:eastAsia="宋体" w:hAnsi="Times New Roman" w:cs="Times New Roman"/>
           <w:b/>
+          <w:color w:val="000000"/>
           <w:sz w:val="24"/>
         </w:rPr>
         <w:t xml:space="preserve">1.1.1 </w:t>
@@ -409,6 +430,7 @@
         <w:rPr>
           <w:rFonts w:ascii="Times New Roman" w:eastAsia="宋体" w:hAnsi="Times New Roman" w:cs="Times New Roman"/>
           <w:b/>
+          <w:color w:val="000000"/>
           <w:sz w:val="24"/>
         </w:rPr>
         <w:t>数字经济与就业结构</w:t>
@@ -416,13 +438,14 @@
     </w:p>
     <w:p>
       <w:pPr>
-        <w:spacing w:after="0" w:line="360" w:lineRule="auto"/>
+        <w:spacing w:after="0" w:line="360" w:lineRule="auto" w:before="0"/>
         <w:ind w:firstLine="480"/>
         <w:jc w:val="both"/>
       </w:pPr>
       <w:r>
         <w:rPr>
           <w:rFonts w:ascii="Times New Roman" w:eastAsia="宋体" w:hAnsi="Times New Roman" w:cs="Times New Roman"/>
+          <w:color w:val="000000"/>
           <w:sz w:val="24"/>
         </w:rPr>
         <w:t>三级标题用于说明更细的分析对象，如变量构建、机制分析、样本选择或稳健性检验。标题段落不做首行缩进，正文段落继续首行缩进。</w:t>
@@ -430,13 +453,16 @@
     </w:p>
     <w:p>
       <w:pPr>
-        <w:spacing w:after="0" w:line="360" w:lineRule="auto"/>
+        <w:spacing w:after="0" w:line="360" w:lineRule="auto" w:before="0"/>
+        <w:ind w:firstLine="0"/>
+        <w:jc w:val="left"/>
         <w:outlineLvl w:val="1"/>
       </w:pPr>
       <w:r>
         <w:rPr>
           <w:rFonts w:ascii="Times New Roman" w:eastAsia="宋体" w:hAnsi="Times New Roman" w:cs="Times New Roman"/>
           <w:b/>
+          <w:color w:val="000000"/>
           <w:sz w:val="24"/>
         </w:rPr>
         <w:t xml:space="preserve">1.2 </w:t>
@@ -445,20 +471,79 @@
         <w:rPr>
           <w:rFonts w:ascii="Times New Roman" w:eastAsia="宋体" w:hAnsi="Times New Roman" w:cs="Times New Roman"/>
           <w:b/>
+          <w:color w:val="000000"/>
           <w:sz w:val="24"/>
         </w:rPr>
         <w:t>研究设计示例</w:t>
       </w:r>
     </w:p>
+    <CT_P>
+      <w:pPr>
+        <w:spacing w:before="0" w:after="0" w:line="360" w:lineRule="auto"/>
+      </w:pPr>
+      <w:r>
+        <w:rPr>
+          <w:rFonts w:ascii="Times New Roman" w:hAnsi="Times New Roman" w:eastAsia="宋体"/>
+          <w:color w:val="000000"/>
+          <w:sz w:val="24"/>
+        </w:rPr>
+        <w:t>1.1.2 数学公式与变量解释</w:t>
+      </w:r>
+    </CT_P>
+    <CT_P>
+      <w:pPr>
+        <w:spacing w:before="0" w:after="0" w:line="360" w:lineRule="auto"/>
+      </w:pPr>
+      <w:r>
+        <w:rPr>
+          <w:rFonts w:ascii="Times New Roman" w:hAnsi="Times New Roman" w:eastAsia="宋体"/>
+          <w:color w:val="000000"/>
+          <w:sz w:val="24"/>
+        </w:rPr>
+        <w:t>数学公式及公式中字母含义应以 MathML 为源表示，并转换为 Word 原生公式对象，避免把正式公式和变量解释长期保留为普通文本。</w:t>
+      </w:r>
+    </CT_P>
+    <CT_P>
+      <w:pPr>
+        <w:spacing w:before="0" w:after="0" w:line="360" w:lineRule="auto"/>
+        <w:jc w:val="center"/>
+      </w:pPr>
+      <m:oMathPara>
+        <m:oMath>
+          <m:r>
+            <m:t>Y</m:t>
+          </m:r>
+          <m:r>
+            <m:t>=</m:t>
+          </m:r>
+          <m:r>
+            <m:t>α</m:t>
+          </m:r>
+          <m:r>
+            <m:t>+</m:t>
+          </m:r>
+          <m:r>
+            <m:t>βX</m:t>
+          </m:r>
+          <m:r>
+            <m:t>+</m:t>
+          </m:r>
+          <m:r>
+            <m:t>ε</m:t>
+          </m:r>
+        </m:oMath>
+      </m:oMathPara>
+    </CT_P>
     <w:p>
       <w:pPr>
-        <w:spacing w:after="0" w:line="360" w:lineRule="auto"/>
+        <w:spacing w:after="0" w:line="360" w:lineRule="auto" w:before="0"/>
         <w:ind w:firstLine="480"/>
         <w:jc w:val="both"/>
       </w:pPr>
       <w:r>
         <w:rPr>
-          <w:rFonts w:ascii="Times New Roman" w:eastAsia="宋体" w:hAnsi="Times New Roman" w:cs="Times New Roman"/>
+          <w:rFonts w:ascii="Times New Roman" w:hAnsi="Times New Roman" w:cs="Times New Roman" w:eastAsia="宋体"/>
+          <w:color w:val="000000"/>
           <w:sz w:val="24"/>
         </w:rPr>
         <w:t>表题位于表格上方，表格整体居中，表格内文字水平居中、垂直居中。三线表只保留顶线、表头下横线和底线。</w:t>
@@ -466,29 +551,17 @@
     </w:p>
     <w:p>
       <w:pPr>
-        <w:spacing w:after="0" w:line="360" w:lineRule="auto"/>
+        <w:spacing w:after="0" w:line="360" w:lineRule="auto" w:before="0"/>
+        <w:ind w:firstLine="0"/>
         <w:jc w:val="center"/>
       </w:pPr>
       <w:r>
         <w:rPr>
-          <w:rFonts w:ascii="Times New Roman" w:eastAsia="宋体" w:hAnsi="Times New Roman" w:cs="Times New Roman"/>
+          <w:rFonts w:ascii="Times New Roman" w:hAnsi="Times New Roman" w:cs="Times New Roman" w:eastAsia="宋体"/>
+          <w:color w:val="000000"/>
           <w:sz w:val="21"/>
         </w:rPr>
-        <w:t>表</w:t>
-      </w:r>
-      <w:r>
-        <w:rPr>
-          <w:rFonts w:ascii="Times New Roman" w:eastAsia="宋体" w:hAnsi="Times New Roman" w:cs="Times New Roman"/>
-          <w:sz w:val="21"/>
-        </w:rPr>
-        <w:t xml:space="preserve">1  </w:t>
-      </w:r>
-      <w:r>
-        <w:rPr>
-          <w:rFonts w:ascii="Times New Roman" w:eastAsia="宋体" w:hAnsi="Times New Roman" w:cs="Times New Roman"/>
-          <w:sz w:val="21"/>
-        </w:rPr>
-        <w:t>变量设计示例</w:t>
+        <w:t>表1.1  变量设计示例</w:t>
       </w:r>
     </w:p>
     <w:tbl>
@@ -514,17 +587,21 @@
               <w:left w:val="nil"/>
               <w:bottom w:val="single" w:sz="6" w:space="0" w:color="000000"/>
               <w:right w:val="nil"/>
+              <w:insideH w:val="nil"/>
+              <w:insideV w:val="nil"/>
             </w:tcBorders>
             <w:vAlign w:val="center"/>
           </w:tcPr>
           <w:p>
             <w:pPr>
-              <w:spacing w:after="0" w:line="360" w:lineRule="auto"/>
+              <w:spacing w:after="0" w:line="240" w:lineRule="auto" w:before="0"/>
+              <w:ind w:firstLine="0"/>
               <w:jc w:val="center"/>
             </w:pPr>
             <w:r>
               <w:rPr>
                 <w:rFonts w:ascii="Times New Roman" w:eastAsia="宋体" w:hAnsi="Times New Roman" w:cs="Times New Roman"/>
+                <w:color w:val="000000"/>
                 <w:sz w:val="18"/>
               </w:rPr>
               <w:t>变量类别</w:t>
@@ -539,17 +616,21 @@
               <w:left w:val="nil"/>
               <w:bottom w:val="single" w:sz="6" w:space="0" w:color="000000"/>
               <w:right w:val="nil"/>
+              <w:insideH w:val="nil"/>
+              <w:insideV w:val="nil"/>
             </w:tcBorders>
             <w:vAlign w:val="center"/>
           </w:tcPr>
           <w:p>
             <w:pPr>
-              <w:spacing w:after="0" w:line="360" w:lineRule="auto"/>
+              <w:spacing w:after="0" w:line="240" w:lineRule="auto" w:before="0"/>
+              <w:ind w:firstLine="0"/>
               <w:jc w:val="center"/>
             </w:pPr>
             <w:r>
               <w:rPr>
                 <w:rFonts w:ascii="Times New Roman" w:eastAsia="宋体" w:hAnsi="Times New Roman" w:cs="Times New Roman"/>
+                <w:color w:val="000000"/>
                 <w:sz w:val="18"/>
               </w:rPr>
               <w:t>变量名称</w:t>
@@ -564,17 +645,21 @@
               <w:left w:val="nil"/>
               <w:bottom w:val="single" w:sz="6" w:space="0" w:color="000000"/>
               <w:right w:val="nil"/>
+              <w:insideH w:val="nil"/>
+              <w:insideV w:val="nil"/>
             </w:tcBorders>
             <w:vAlign w:val="center"/>
           </w:tcPr>
           <w:p>
             <w:pPr>
-              <w:spacing w:after="0" w:line="360" w:lineRule="auto"/>
+              <w:spacing w:after="0" w:line="240" w:lineRule="auto" w:before="0"/>
+              <w:ind w:firstLine="0"/>
               <w:jc w:val="center"/>
             </w:pPr>
             <w:r>
               <w:rPr>
                 <w:rFonts w:ascii="Times New Roman" w:eastAsia="宋体" w:hAnsi="Times New Roman" w:cs="Times New Roman"/>
+                <w:color w:val="000000"/>
                 <w:sz w:val="18"/>
               </w:rPr>
               <w:t>说明</w:t>
@@ -594,17 +679,21 @@
               <w:left w:val="nil"/>
               <w:bottom w:val="nil"/>
               <w:right w:val="nil"/>
+              <w:insideH w:val="nil"/>
+              <w:insideV w:val="nil"/>
             </w:tcBorders>
             <w:vAlign w:val="center"/>
           </w:tcPr>
           <w:p>
             <w:pPr>
-              <w:spacing w:after="0" w:line="360" w:lineRule="auto"/>
+              <w:spacing w:after="0" w:line="240" w:lineRule="auto" w:before="0"/>
+              <w:ind w:firstLine="0"/>
               <w:jc w:val="center"/>
             </w:pPr>
             <w:r>
               <w:rPr>
                 <w:rFonts w:ascii="Times New Roman" w:eastAsia="宋体" w:hAnsi="Times New Roman" w:cs="Times New Roman"/>
+                <w:color w:val="000000"/>
                 <w:sz w:val="18"/>
               </w:rPr>
               <w:t>被解释变量</w:t>
@@ -619,17 +708,21 @@
               <w:left w:val="nil"/>
               <w:bottom w:val="nil"/>
               <w:right w:val="nil"/>
+              <w:insideH w:val="nil"/>
+              <w:insideV w:val="nil"/>
             </w:tcBorders>
             <w:vAlign w:val="center"/>
           </w:tcPr>
           <w:p>
             <w:pPr>
-              <w:spacing w:after="0" w:line="360" w:lineRule="auto"/>
+              <w:spacing w:after="0" w:line="240" w:lineRule="auto" w:before="0"/>
+              <w:ind w:firstLine="0"/>
               <w:jc w:val="center"/>
             </w:pPr>
             <w:r>
               <w:rPr>
                 <w:rFonts w:ascii="Times New Roman" w:eastAsia="宋体" w:hAnsi="Times New Roman" w:cs="Times New Roman"/>
+                <w:color w:val="000000"/>
                 <w:sz w:val="18"/>
               </w:rPr>
               <w:t>大学生就业率</w:t>
@@ -644,17 +737,21 @@
               <w:left w:val="nil"/>
               <w:bottom w:val="nil"/>
               <w:right w:val="nil"/>
+              <w:insideH w:val="nil"/>
+              <w:insideV w:val="nil"/>
             </w:tcBorders>
             <w:vAlign w:val="center"/>
           </w:tcPr>
           <w:p>
             <w:pPr>
-              <w:spacing w:after="0" w:line="360" w:lineRule="auto"/>
+              <w:spacing w:after="0" w:line="240" w:lineRule="auto" w:before="0"/>
+              <w:ind w:firstLine="0"/>
               <w:jc w:val="center"/>
             </w:pPr>
             <w:r>
               <w:rPr>
                 <w:rFonts w:ascii="Times New Roman" w:eastAsia="宋体" w:hAnsi="Times New Roman" w:cs="Times New Roman"/>
+                <w:color w:val="000000"/>
                 <w:sz w:val="18"/>
               </w:rPr>
               <w:t>用于衡量大学生就业结果</w:t>
@@ -674,17 +771,21 @@
               <w:left w:val="nil"/>
               <w:bottom w:val="nil"/>
               <w:right w:val="nil"/>
+              <w:insideH w:val="nil"/>
+              <w:insideV w:val="nil"/>
             </w:tcBorders>
             <w:vAlign w:val="center"/>
           </w:tcPr>
           <w:p>
             <w:pPr>
-              <w:spacing w:after="0" w:line="360" w:lineRule="auto"/>
+              <w:spacing w:after="0" w:line="240" w:lineRule="auto" w:before="0"/>
+              <w:ind w:firstLine="0"/>
               <w:jc w:val="center"/>
             </w:pPr>
             <w:r>
               <w:rPr>
                 <w:rFonts w:ascii="Times New Roman" w:eastAsia="宋体" w:hAnsi="Times New Roman" w:cs="Times New Roman"/>
+                <w:color w:val="000000"/>
                 <w:sz w:val="18"/>
               </w:rPr>
               <w:t>核心解释变量</w:t>
@@ -699,17 +800,21 @@
               <w:left w:val="nil"/>
               <w:bottom w:val="nil"/>
               <w:right w:val="nil"/>
+              <w:insideH w:val="nil"/>
+              <w:insideV w:val="nil"/>
             </w:tcBorders>
             <w:vAlign w:val="center"/>
           </w:tcPr>
           <w:p>
             <w:pPr>
-              <w:spacing w:after="0" w:line="360" w:lineRule="auto"/>
+              <w:spacing w:after="0" w:line="240" w:lineRule="auto" w:before="0"/>
+              <w:ind w:firstLine="0"/>
               <w:jc w:val="center"/>
             </w:pPr>
             <w:r>
               <w:rPr>
                 <w:rFonts w:ascii="Times New Roman" w:eastAsia="宋体" w:hAnsi="Times New Roman" w:cs="Times New Roman"/>
+                <w:color w:val="000000"/>
                 <w:sz w:val="18"/>
               </w:rPr>
               <w:t>数字经济发展水平</w:t>
@@ -724,17 +829,21 @@
               <w:left w:val="nil"/>
               <w:bottom w:val="nil"/>
               <w:right w:val="nil"/>
+              <w:insideH w:val="nil"/>
+              <w:insideV w:val="nil"/>
             </w:tcBorders>
             <w:vAlign w:val="center"/>
           </w:tcPr>
           <w:p>
             <w:pPr>
-              <w:spacing w:after="0" w:line="360" w:lineRule="auto"/>
+              <w:spacing w:after="0" w:line="240" w:lineRule="auto" w:before="0"/>
+              <w:ind w:firstLine="0"/>
               <w:jc w:val="center"/>
             </w:pPr>
             <w:r>
               <w:rPr>
                 <w:rFonts w:ascii="Times New Roman" w:eastAsia="宋体" w:hAnsi="Times New Roman" w:cs="Times New Roman"/>
+                <w:color w:val="000000"/>
                 <w:sz w:val="18"/>
               </w:rPr>
               <w:t>可由多维指标综合测度</w:t>
@@ -754,17 +863,21 @@
               <w:left w:val="nil"/>
               <w:bottom w:val="single" w:sz="12" w:space="0" w:color="000000"/>
               <w:right w:val="nil"/>
+              <w:insideH w:val="nil"/>
+              <w:insideV w:val="nil"/>
             </w:tcBorders>
             <w:vAlign w:val="center"/>
           </w:tcPr>
           <w:p>
             <w:pPr>
-              <w:spacing w:after="0" w:line="360" w:lineRule="auto"/>
+              <w:spacing w:after="0" w:line="240" w:lineRule="auto" w:before="0"/>
+              <w:ind w:firstLine="0"/>
               <w:jc w:val="center"/>
             </w:pPr>
             <w:r>
               <w:rPr>
                 <w:rFonts w:ascii="Times New Roman" w:eastAsia="宋体" w:hAnsi="Times New Roman" w:cs="Times New Roman"/>
+                <w:color w:val="000000"/>
                 <w:sz w:val="18"/>
               </w:rPr>
               <w:t>控制变量</w:t>
@@ -779,17 +892,21 @@
               <w:left w:val="nil"/>
               <w:bottom w:val="single" w:sz="12" w:space="0" w:color="000000"/>
               <w:right w:val="nil"/>
+              <w:insideH w:val="nil"/>
+              <w:insideV w:val="nil"/>
             </w:tcBorders>
             <w:vAlign w:val="center"/>
           </w:tcPr>
           <w:p>
             <w:pPr>
-              <w:spacing w:after="0" w:line="360" w:lineRule="auto"/>
+              <w:spacing w:after="0" w:line="240" w:lineRule="auto" w:before="0"/>
+              <w:ind w:firstLine="0"/>
               <w:jc w:val="center"/>
             </w:pPr>
             <w:r>
               <w:rPr>
                 <w:rFonts w:ascii="Times New Roman" w:eastAsia="宋体" w:hAnsi="Times New Roman" w:cs="Times New Roman"/>
+                <w:color w:val="000000"/>
                 <w:sz w:val="18"/>
               </w:rPr>
               <w:t>个体与地区特征</w:t>
@@ -804,17 +921,21 @@
               <w:left w:val="nil"/>
               <w:bottom w:val="single" w:sz="12" w:space="0" w:color="000000"/>
               <w:right w:val="nil"/>
+              <w:insideH w:val="nil"/>
+              <w:insideV w:val="nil"/>
             </w:tcBorders>
             <w:vAlign w:val="center"/>
           </w:tcPr>
           <w:p>
             <w:pPr>
-              <w:spacing w:after="0" w:line="360" w:lineRule="auto"/>
+              <w:spacing w:after="0" w:line="240" w:lineRule="auto" w:before="0"/>
+              <w:ind w:firstLine="0"/>
               <w:jc w:val="center"/>
             </w:pPr>
             <w:r>
               <w:rPr>
                 <w:rFonts w:ascii="Times New Roman" w:eastAsia="宋体" w:hAnsi="Times New Roman" w:cs="Times New Roman"/>
+                <w:color w:val="000000"/>
                 <w:sz w:val="18"/>
               </w:rPr>
               <w:t>用于降低遗漏变量影响</w:t>
@@ -825,40 +946,31 @@
     </w:tbl>
     <w:p>
       <w:pPr>
-        <w:spacing w:after="0" w:line="360" w:lineRule="auto"/>
+        <w:spacing w:after="0" w:line="360" w:lineRule="auto" w:before="0"/>
+        <w:ind w:firstLine="0"/>
         <w:jc w:val="center"/>
       </w:pPr>
       <w:r>
         <w:rPr>
-          <w:rFonts w:ascii="Times New Roman" w:eastAsia="宋体" w:hAnsi="Times New Roman" w:cs="Times New Roman"/>
+          <w:rFonts w:ascii="Times New Roman" w:hAnsi="Times New Roman" w:cs="Times New Roman" w:eastAsia="宋体"/>
+          <w:color w:val="000000"/>
           <w:sz w:val="21"/>
         </w:rPr>
-        <w:t>图</w:t>
-      </w:r>
-      <w:r>
-        <w:rPr>
-          <w:rFonts w:ascii="Times New Roman" w:eastAsia="宋体" w:hAnsi="Times New Roman" w:cs="Times New Roman"/>
-          <w:sz w:val="21"/>
-        </w:rPr>
-        <w:t xml:space="preserve">1  </w:t>
-      </w:r>
-      <w:r>
-        <w:rPr>
-          <w:rFonts w:ascii="Times New Roman" w:eastAsia="宋体" w:hAnsi="Times New Roman" w:cs="Times New Roman"/>
-          <w:sz w:val="21"/>
-        </w:rPr>
-        <w:t>图片题注示例（插入图片后，图片段落和题注均应居中）</w:t>
+        <w:t>图1.1  图片题注示例（插入图片后，图片段落和题注均应居中）</w:t>
       </w:r>
     </w:p>
     <w:p>
       <w:pPr>
-        <w:spacing w:after="0" w:line="360" w:lineRule="auto"/>
+        <w:spacing w:after="0" w:line="360" w:lineRule="auto" w:before="0"/>
+        <w:ind w:firstLine="0"/>
+        <w:jc w:val="left"/>
         <w:outlineLvl w:val="0"/>
       </w:pPr>
       <w:r>
         <w:rPr>
           <w:rFonts w:ascii="Times New Roman" w:eastAsia="宋体" w:hAnsi="Times New Roman" w:cs="Times New Roman"/>
           <w:b/>
+          <w:color w:val="000000"/>
           <w:sz w:val="28"/>
         </w:rPr>
         <w:lastRenderedPageBreak/>
@@ -867,13 +979,14 @@
     </w:p>
     <w:p>
       <w:pPr>
-        <w:spacing w:after="0" w:line="360" w:lineRule="auto"/>
+        <w:spacing w:after="0" w:line="360" w:lineRule="auto" w:before="0"/>
         <w:ind w:firstLine="480"/>
         <w:jc w:val="both"/>
       </w:pPr>
       <w:r>
         <w:rPr>
           <w:rFonts w:ascii="Times New Roman" w:eastAsia="宋体" w:hAnsi="Times New Roman" w:cs="Times New Roman"/>
+          <w:color w:val="000000"/>
           <w:sz w:val="24"/>
         </w:rPr>
         <w:t>本模板只提供格式参考。正式写作时，应根据具体课程要求、导师要求或学校模板调整标题层级、封面信息、图表编号和参考文献格式。</w:t>
@@ -881,7 +994,7 @@
     </w:p>
     <w:p>
       <w:pPr>
-        <w:spacing w:after="0" w:line="360" w:lineRule="auto"/>
+        <w:spacing w:after="0" w:line="360" w:lineRule="auto" w:before="0"/>
         <w:ind w:firstLine="480"/>
         <w:jc w:val="both"/>
         <w:outlineLvl w:val="0"/>
@@ -890,6 +1003,7 @@
         <w:rPr>
           <w:rFonts w:ascii="Times New Roman" w:eastAsia="宋体" w:hAnsi="Times New Roman" w:cs="Times New Roman"/>
           <w:b/>
+          <w:color w:val="000000"/>
           <w:sz w:val="24"/>
         </w:rPr>
         <w:t>参考文献</w:t>
@@ -897,12 +1011,14 @@
     </w:p>
     <w:p>
       <w:pPr>
-        <w:spacing w:after="0" w:line="360" w:lineRule="auto"/>
+        <w:spacing w:after="0" w:line="360" w:lineRule="auto" w:before="0"/>
+        <w:ind w:firstLine="0"/>
         <w:jc w:val="both"/>
       </w:pPr>
       <w:r>
         <w:rPr>
           <w:rFonts w:ascii="Times New Roman" w:eastAsia="宋体" w:hAnsi="Times New Roman" w:cs="Times New Roman"/>
+          <w:color w:val="000000"/>
           <w:sz w:val="24"/>
         </w:rPr>
         <w:t xml:space="preserve">[1] </w:t>
@@ -910,6 +1026,7 @@
       <w:r>
         <w:rPr>
           <w:rFonts w:ascii="Times New Roman" w:eastAsia="宋体" w:hAnsi="Times New Roman" w:cs="Times New Roman"/>
+          <w:color w:val="000000"/>
           <w:sz w:val="24"/>
         </w:rPr>
         <w:t>作者</w:t>
@@ -917,6 +1034,7 @@
       <w:r>
         <w:rPr>
           <w:rFonts w:ascii="Times New Roman" w:eastAsia="宋体" w:hAnsi="Times New Roman" w:cs="Times New Roman"/>
+          <w:color w:val="000000"/>
           <w:sz w:val="24"/>
         </w:rPr>
         <w:t xml:space="preserve">. </w:t>
@@ -924,6 +1042,7 @@
       <w:r>
         <w:rPr>
           <w:rFonts w:ascii="Times New Roman" w:eastAsia="宋体" w:hAnsi="Times New Roman" w:cs="Times New Roman"/>
+          <w:color w:val="000000"/>
           <w:sz w:val="24"/>
         </w:rPr>
         <w:t>中文论文格式示例</w:t>
@@ -931,6 +1050,7 @@
       <w:r>
         <w:rPr>
           <w:rFonts w:ascii="Times New Roman" w:eastAsia="宋体" w:hAnsi="Times New Roman" w:cs="Times New Roman"/>
+          <w:color w:val="000000"/>
           <w:sz w:val="24"/>
         </w:rPr>
         <w:t xml:space="preserve">[J]. </w:t>
@@ -938,6 +1058,7 @@
       <w:r>
         <w:rPr>
           <w:rFonts w:ascii="Times New Roman" w:eastAsia="宋体" w:hAnsi="Times New Roman" w:cs="Times New Roman"/>
+          <w:color w:val="000000"/>
           <w:sz w:val="24"/>
         </w:rPr>
         <w:t>示例期刊</w:t>
@@ -945,6 +1066,7 @@
       <w:r>
         <w:rPr>
           <w:rFonts w:ascii="Times New Roman" w:eastAsia="宋体" w:hAnsi="Times New Roman" w:cs="Times New Roman"/>
+          <w:color w:val="000000"/>
           <w:sz w:val="24"/>
         </w:rPr>
         <w:t>, 2026.</w:t>
@@ -952,12 +1074,14 @@
     </w:p>
     <w:p>
       <w:pPr>
-        <w:spacing w:after="0" w:line="360" w:lineRule="auto"/>
+        <w:spacing w:after="0" w:line="360" w:lineRule="auto" w:before="0"/>
+        <w:ind w:firstLine="0"/>
         <w:jc w:val="both"/>
       </w:pPr>
       <w:r>
         <w:rPr>
           <w:rFonts w:ascii="Times New Roman" w:eastAsia="宋体" w:hAnsi="Times New Roman" w:cs="Times New Roman"/>
+          <w:color w:val="000000"/>
           <w:sz w:val="24"/>
         </w:rPr>
         <w:t>[2] Author A, Author B. English Reference Example[J]. Journal Name, 2026, 1(1): 1-10.</w:t>

</xml_diff>

<commit_message>
Use hyphenated caption numbering and drafted titles
</commit_message>
<xml_diff>
--- a/assets/template.docx
+++ b/assets/template.docx
@@ -561,7 +561,7 @@
           <w:color w:val="000000"/>
           <w:sz w:val="21"/>
         </w:rPr>
-        <w:t>表1.1  变量设计示例</w:t>
+        <w:t>表1-1  变量设计示例</w:t>
       </w:r>
     </w:p>
     <w:tbl>
@@ -956,7 +956,7 @@
           <w:color w:val="000000"/>
           <w:sz w:val="21"/>
         </w:rPr>
-        <w:t>图1.1  图片题注示例（插入图片后，图片段落和题注均应居中）</w:t>
+        <w:t>图1-1  图片题注示例（插入图片后，图片段落和题注均应居中）</w:t>
       </w:r>
     </w:p>
     <w:p>

</xml_diff>

<commit_message>
Set caption line spacing to single
</commit_message>
<xml_diff>
--- a/assets/template.docx
+++ b/assets/template.docx
@@ -551,7 +551,7 @@
     </w:p>
     <w:p>
       <w:pPr>
-        <w:spacing w:after="0" w:line="360" w:lineRule="auto" w:before="0"/>
+        <w:spacing w:after="0" w:line="240" w:lineRule="auto" w:before="0"/>
         <w:ind w:firstLine="0"/>
         <w:jc w:val="center"/>
       </w:pPr>
@@ -946,7 +946,7 @@
     </w:tbl>
     <w:p>
       <w:pPr>
-        <w:spacing w:after="0" w:line="360" w:lineRule="auto" w:before="0"/>
+        <w:spacing w:after="0" w:line="240" w:lineRule="auto" w:before="0"/>
         <w:ind w:firstLine="0"/>
         <w:jc w:val="center"/>
       </w:pPr>

</xml_diff>

<commit_message>
Add title and footer page number formatting
</commit_message>
<xml_diff>
--- a/assets/template.docx
+++ b/assets/template.docx
@@ -5,15 +5,15 @@
     <w:p>
       <w:pPr>
         <w:spacing w:after="0" w:line="360" w:lineRule="auto" w:before="0"/>
-        <w:ind w:firstLine="480"/>
-        <w:jc w:val="both"/>
+        <w:ind w:firstLine="0"/>
+        <w:jc w:val="center"/>
       </w:pPr>
       <w:r>
         <w:rPr>
           <w:rFonts w:ascii="Times New Roman" w:eastAsia="宋体" w:hAnsi="Times New Roman" w:cs="Times New Roman"/>
           <w:b/>
           <w:color w:val="000000"/>
-          <w:sz w:val="24"/>
+          <w:sz w:val="36"/>
         </w:rPr>
         <w:t>中文论文格式参考模板</w:t>
       </w:r>
@@ -1088,6 +1088,7 @@
       </w:r>
     </w:p>
     <w:sectPr>
+      <w:footerReference w:type="default" r:id="rId8"/>
       <w:pgSz w:w="11906" w:h="16838"/>
       <w:pgMar w:top="1417" w:right="1417" w:bottom="1417" w:left="1417" w:header="720" w:footer="720" w:gutter="0"/>
       <w:cols w:space="720"/>
@@ -1095,6 +1096,31 @@
     </w:sectPr>
   </w:body>
 </w:document>
+</file>
+
+<file path=word/footer1.xml><?xml version="1.0" encoding="utf-8"?>
+<w:ftr xmlns:m="http://schemas.openxmlformats.org/officeDocument/2006/math" xmlns:mc="http://schemas.openxmlformats.org/markup-compatibility/2006" xmlns:mo="http://schemas.microsoft.com/office/mac/office/2008/main" xmlns:mv="urn:schemas-microsoft-com:mac:vml" xmlns:o="urn:schemas-microsoft-com:office:office" xmlns:r="http://schemas.openxmlformats.org/officeDocument/2006/relationships" xmlns:v="urn:schemas-microsoft-com:vml" xmlns:w10="urn:schemas-microsoft-com:office:word" xmlns:w14="http://schemas.microsoft.com/office/word/2010/wordml" xmlns:w="http://schemas.openxmlformats.org/wordprocessingml/2006/main" xmlns:wne="http://schemas.microsoft.com/office/word/2006/wordml" xmlns:wp14="http://schemas.microsoft.com/office/word/2010/wordprocessingDrawing" xmlns:wp="http://schemas.openxmlformats.org/drawingml/2006/wordprocessingDrawing" xmlns:wpc="http://schemas.microsoft.com/office/word/2010/wordprocessingCanvas" xmlns:wpg="http://schemas.microsoft.com/office/word/2010/wordprocessingGroup" xmlns:wpi="http://schemas.microsoft.com/office/word/2010/wordprocessingInk" xmlns:wps="http://schemas.microsoft.com/office/word/2010/wordprocessingShape" mc:Ignorable="w14 wp14">
+  <w:p>
+    <w:pPr>
+      <w:pStyle w:val="Footer"/>
+      <w:spacing w:before="0" w:after="0" w:line="240" w:lineRule="auto"/>
+      <w:ind w:firstLine="0"/>
+      <w:jc w:val="center"/>
+    </w:pPr>
+    <w:r>
+      <w:rPr>
+        <w:rFonts w:ascii="Times New Roman" w:hAnsi="Times New Roman" w:cs="Times New Roman" w:eastAsia="宋体"/>
+        <w:color w:val="000000"/>
+        <w:sz w:val="24"/>
+      </w:rPr>
+      <w:fldChar w:fldCharType="begin"/>
+      <w:instrText xml:space="preserve"> PAGE </w:instrText>
+      <w:fldChar w:fldCharType="separate"/>
+      <w:t>1</w:t>
+      <w:fldChar w:fldCharType="end"/>
+    </w:r>
+  </w:p>
+</w:ftr>
 </file>
 
 <file path=word/numbering.xml><?xml version="1.0" encoding="utf-8"?>

</xml_diff>